<commit_message>
Report some sentences left to add
</commit_message>
<xml_diff>
--- a/mathcad/Лабораторная-работа-3/ПРИ123-ММГО-#03-Нямаа.docx
+++ b/mathcad/Лабораторная-работа-3/ПРИ123-ММГО-#03-Нямаа.docx
@@ -559,9 +559,6 @@
     <w:p>
       <w:pPr>
         <w:jc w:val="center"/>
-        <w:rPr>
-          <w:lang w:val="en-US"/>
-        </w:rPr>
       </w:pPr>
       <w:r>
         <w:rPr>
@@ -574,7 +571,6 @@
         <w:rPr>
           <w:sz w:val="44"/>
           <w:szCs w:val="44"/>
-          <w:lang w:val="en-US"/>
         </w:rPr>
         <w:t>3</w:t>
       </w:r>
@@ -869,14 +865,14 @@
         <w:rPr>
           <w:sz w:val="28"/>
         </w:rPr>
-        <w:t>в среде M</w:t>
+        <w:t xml:space="preserve">в среде </w:t>
       </w:r>
       <w:proofErr w:type="spellStart"/>
       <w:r>
         <w:rPr>
           <w:sz w:val="28"/>
         </w:rPr>
-        <w:t>athCAD</w:t>
+        <w:t>MathCAD</w:t>
       </w:r>
       <w:proofErr w:type="spellEnd"/>
       <w:r>
@@ -1007,7 +1003,25 @@
           <w:sz w:val="28"/>
           <w:szCs w:val="28"/>
         </w:rPr>
-        <w:t>Пример 2.1.</w:t>
+        <w:t xml:space="preserve">Пример </w:t>
+      </w:r>
+      <w:r>
+        <w:rPr>
+          <w:b/>
+          <w:bCs/>
+          <w:sz w:val="28"/>
+          <w:szCs w:val="28"/>
+        </w:rPr>
+        <w:t>3</w:t>
+      </w:r>
+      <w:r>
+        <w:rPr>
+          <w:b/>
+          <w:bCs/>
+          <w:sz w:val="28"/>
+          <w:szCs w:val="28"/>
+        </w:rPr>
+        <w:t>.1.</w:t>
       </w:r>
       <w:r>
         <w:rPr>
@@ -1029,6 +1043,49 @@
           <w:lang w:val="ru-RU"/>
         </w:rPr>
       </w:pPr>
+      <w:r>
+        <w:rPr>
+          <w:rFonts w:ascii="Times New Roman" w:hAnsi="Times New Roman"/>
+          <w:sz w:val="28"/>
+          <w:szCs w:val="28"/>
+          <w:lang w:val="ru-RU"/>
+        </w:rPr>
+        <w:drawing>
+          <wp:inline distT="0" distB="0" distL="0" distR="0" wp14:anchorId="5B151103" wp14:editId="32CDD763">
+            <wp:extent cx="2876550" cy="5203940"/>
+            <wp:effectExtent l="0" t="0" r="0" b="0"/>
+            <wp:docPr id="1" name="Рисунок 1"/>
+            <wp:cNvGraphicFramePr>
+              <a:graphicFrameLocks xmlns:a="http://schemas.openxmlformats.org/drawingml/2006/main" noChangeAspect="1"/>
+            </wp:cNvGraphicFramePr>
+            <a:graphic xmlns:a="http://schemas.openxmlformats.org/drawingml/2006/main">
+              <a:graphicData uri="http://schemas.openxmlformats.org/drawingml/2006/picture">
+                <pic:pic xmlns:pic="http://schemas.openxmlformats.org/drawingml/2006/picture">
+                  <pic:nvPicPr>
+                    <pic:cNvPr id="1" name=""/>
+                    <pic:cNvPicPr/>
+                  </pic:nvPicPr>
+                  <pic:blipFill>
+                    <a:blip r:embed="rId6"/>
+                    <a:stretch>
+                      <a:fillRect/>
+                    </a:stretch>
+                  </pic:blipFill>
+                  <pic:spPr>
+                    <a:xfrm>
+                      <a:off x="0" y="0"/>
+                      <a:ext cx="2879329" cy="5208967"/>
+                    </a:xfrm>
+                    <a:prstGeom prst="rect">
+                      <a:avLst/>
+                    </a:prstGeom>
+                  </pic:spPr>
+                </pic:pic>
+              </a:graphicData>
+            </a:graphic>
+          </wp:inline>
+        </w:drawing>
+      </w:r>
     </w:p>
     <w:p>
       <w:pPr>
@@ -1051,7 +1108,14 @@
           <w:sz w:val="28"/>
           <w:szCs w:val="28"/>
         </w:rPr>
-        <w:t>2.1</w:t>
+        <w:t>3</w:t>
+      </w:r>
+      <w:r>
+        <w:rPr>
+          <w:sz w:val="28"/>
+          <w:szCs w:val="28"/>
+        </w:rPr>
+        <w:t>.1</w:t>
       </w:r>
       <w:r>
         <w:rPr>
@@ -1059,48 +1123,6 @@
           <w:szCs w:val="28"/>
         </w:rPr>
         <w:t>.</w:t>
-      </w:r>
-    </w:p>
-    <w:p>
-      <w:pPr>
-        <w:spacing w:line="360" w:lineRule="auto"/>
-        <w:jc w:val="center"/>
-        <w:rPr>
-          <w:sz w:val="28"/>
-          <w:szCs w:val="28"/>
-          <w:lang w:val="en-US"/>
-        </w:rPr>
-      </w:pPr>
-    </w:p>
-    <w:p>
-      <w:pPr>
-        <w:spacing w:line="360" w:lineRule="auto"/>
-        <w:jc w:val="center"/>
-        <w:rPr>
-          <w:sz w:val="28"/>
-          <w:szCs w:val="28"/>
-        </w:rPr>
-      </w:pPr>
-      <w:r>
-        <w:rPr>
-          <w:sz w:val="28"/>
-          <w:szCs w:val="28"/>
-        </w:rPr>
-        <w:t xml:space="preserve">ЗАДАНИЕ </w:t>
-      </w:r>
-      <w:r>
-        <w:rPr>
-          <w:sz w:val="28"/>
-          <w:szCs w:val="28"/>
-        </w:rPr>
-        <w:t>2</w:t>
-      </w:r>
-      <w:r>
-        <w:rPr>
-          <w:sz w:val="28"/>
-          <w:szCs w:val="28"/>
-        </w:rPr>
-        <w:t xml:space="preserve"> (вариант 14).</w:t>
       </w:r>
     </w:p>
     <w:p>
@@ -1109,88 +1131,155 @@
         <w:ind w:firstLine="709"/>
         <w:jc w:val="both"/>
         <w:rPr>
-          <w:sz w:val="28"/>
-          <w:szCs w:val="28"/>
-        </w:rPr>
-      </w:pPr>
-      <w:r>
-        <w:rPr>
-          <w:sz w:val="28"/>
-          <w:szCs w:val="28"/>
-        </w:rPr>
-        <w:t>Построить в пространстве каркасную треугольную пирамиду, заданную координатами вершин</w:t>
-      </w:r>
-      <w:r>
-        <w:rPr>
+          <w:b/>
+          <w:bCs/>
+          <w:sz w:val="28"/>
+          <w:szCs w:val="28"/>
+        </w:rPr>
+      </w:pPr>
+      <w:r>
+        <w:rPr>
+          <w:b/>
+          <w:bCs/>
+          <w:sz w:val="28"/>
+          <w:szCs w:val="28"/>
+        </w:rPr>
+        <w:lastRenderedPageBreak/>
+        <w:t xml:space="preserve">Пример </w:t>
+      </w:r>
+      <w:r>
+        <w:rPr>
+          <w:b/>
+          <w:bCs/>
+          <w:sz w:val="28"/>
+          <w:szCs w:val="28"/>
+        </w:rPr>
+        <w:t>3</w:t>
+      </w:r>
+      <w:r>
+        <w:rPr>
+          <w:b/>
+          <w:bCs/>
+          <w:sz w:val="28"/>
+          <w:szCs w:val="28"/>
+        </w:rPr>
+        <w:t>.</w:t>
+      </w:r>
+      <w:r>
+        <w:rPr>
+          <w:b/>
+          <w:bCs/>
+          <w:sz w:val="28"/>
+          <w:szCs w:val="28"/>
+        </w:rPr>
+        <w:t>2</w:t>
+      </w:r>
+      <w:r>
+        <w:rPr>
+          <w:b/>
+          <w:bCs/>
+          <w:sz w:val="28"/>
+          <w:szCs w:val="28"/>
+        </w:rPr>
+        <w:t>.</w:t>
+      </w:r>
+      <w:r>
+        <w:rPr>
+          <w:b/>
+          <w:bCs/>
           <w:sz w:val="28"/>
           <w:szCs w:val="28"/>
         </w:rPr>
         <w:t xml:space="preserve"> </w:t>
       </w:r>
-      <w:r>
-        <w:rPr>
-          <w:sz w:val="28"/>
-          <w:szCs w:val="28"/>
-          <w:lang w:val="en-US"/>
-        </w:rPr>
-        <w:t>x</w:t>
-      </w:r>
-      <w:r>
-        <w:rPr>
-          <w:sz w:val="28"/>
-          <w:szCs w:val="28"/>
-        </w:rPr>
-        <w:t xml:space="preserve">1 </w:t>
-      </w:r>
-      <w:r>
-        <w:rPr>
-          <w:sz w:val="28"/>
-          <w:szCs w:val="28"/>
-        </w:rPr>
-        <w:t xml:space="preserve">– </w:t>
-      </w:r>
-      <w:r>
-        <w:rPr>
-          <w:sz w:val="28"/>
-          <w:szCs w:val="28"/>
-        </w:rPr>
-        <w:t>6</w:t>
-      </w:r>
-      <w:r>
-        <w:rPr>
-          <w:sz w:val="28"/>
-          <w:szCs w:val="28"/>
-        </w:rPr>
-        <w:t xml:space="preserve">, </w:t>
-      </w:r>
-      <w:r>
-        <w:rPr>
-          <w:sz w:val="28"/>
-          <w:szCs w:val="28"/>
-          <w:lang w:val="en-US"/>
-        </w:rPr>
-        <w:t>y</w:t>
-      </w:r>
-      <w:r>
-        <w:rPr>
-          <w:sz w:val="28"/>
-          <w:szCs w:val="28"/>
-        </w:rPr>
-        <w:t xml:space="preserve">1 </w:t>
-      </w:r>
-      <w:r>
-        <w:rPr>
-          <w:sz w:val="28"/>
-          <w:szCs w:val="28"/>
-        </w:rPr>
-        <w:t>–</w:t>
-      </w:r>
-      <w:r>
-        <w:rPr>
-          <w:sz w:val="28"/>
-          <w:szCs w:val="28"/>
-        </w:rPr>
-        <w:t xml:space="preserve"> </w:t>
+    </w:p>
+    <w:p>
+      <w:pPr>
+        <w:spacing w:line="360" w:lineRule="auto"/>
+        <w:jc w:val="center"/>
+        <w:rPr>
+          <w:sz w:val="28"/>
+          <w:szCs w:val="28"/>
+        </w:rPr>
+      </w:pPr>
+      <w:r>
+        <w:rPr>
+          <w:sz w:val="28"/>
+          <w:szCs w:val="28"/>
+        </w:rPr>
+        <w:drawing>
+          <wp:inline distT="0" distB="0" distL="0" distR="0" wp14:anchorId="5CD0436A" wp14:editId="5C5BE8B9">
+            <wp:extent cx="3676650" cy="4564142"/>
+            <wp:effectExtent l="0" t="0" r="0" b="0"/>
+            <wp:docPr id="2" name="Рисунок 2"/>
+            <wp:cNvGraphicFramePr>
+              <a:graphicFrameLocks xmlns:a="http://schemas.openxmlformats.org/drawingml/2006/main" noChangeAspect="1"/>
+            </wp:cNvGraphicFramePr>
+            <a:graphic xmlns:a="http://schemas.openxmlformats.org/drawingml/2006/main">
+              <a:graphicData uri="http://schemas.openxmlformats.org/drawingml/2006/picture">
+                <pic:pic xmlns:pic="http://schemas.openxmlformats.org/drawingml/2006/picture">
+                  <pic:nvPicPr>
+                    <pic:cNvPr id="1" name=""/>
+                    <pic:cNvPicPr/>
+                  </pic:nvPicPr>
+                  <pic:blipFill rotWithShape="1">
+                    <a:blip r:embed="rId7"/>
+                    <a:srcRect l="1698" r="-1"/>
+                    <a:stretch/>
+                  </pic:blipFill>
+                  <pic:spPr bwMode="auto">
+                    <a:xfrm>
+                      <a:off x="0" y="0"/>
+                      <a:ext cx="3682584" cy="4571509"/>
+                    </a:xfrm>
+                    <a:prstGeom prst="rect">
+                      <a:avLst/>
+                    </a:prstGeom>
+                    <a:ln>
+                      <a:noFill/>
+                    </a:ln>
+                    <a:extLst>
+                      <a:ext uri="{53640926-AAD7-44D8-BBD7-CCE9431645EC}">
+                        <a14:shadowObscured xmlns:a14="http://schemas.microsoft.com/office/drawing/2010/main"/>
+                      </a:ext>
+                    </a:extLst>
+                  </pic:spPr>
+                </pic:pic>
+              </a:graphicData>
+            </a:graphic>
+          </wp:inline>
+        </w:drawing>
+      </w:r>
+    </w:p>
+    <w:p>
+      <w:pPr>
+        <w:spacing w:line="360" w:lineRule="auto"/>
+        <w:jc w:val="center"/>
+        <w:rPr>
+          <w:sz w:val="28"/>
+          <w:szCs w:val="28"/>
+        </w:rPr>
+      </w:pPr>
+      <w:r>
+        <w:rPr>
+          <w:sz w:val="28"/>
+          <w:szCs w:val="28"/>
+        </w:rPr>
+        <w:t xml:space="preserve">Рисунок </w:t>
+      </w:r>
+      <w:r>
+        <w:rPr>
+          <w:sz w:val="28"/>
+          <w:szCs w:val="28"/>
+        </w:rPr>
+        <w:t>2</w:t>
+      </w:r>
+      <w:r>
+        <w:rPr>
+          <w:sz w:val="28"/>
+          <w:szCs w:val="28"/>
+        </w:rPr>
+        <w:t xml:space="preserve">. Выполнение пример </w:t>
       </w:r>
       <w:r>
         <w:rPr>
@@ -1204,314 +1293,155 @@
           <w:sz w:val="28"/>
           <w:szCs w:val="28"/>
         </w:rPr>
-        <w:t xml:space="preserve">, </w:t>
-      </w:r>
-      <w:r>
-        <w:rPr>
-          <w:sz w:val="28"/>
-          <w:szCs w:val="28"/>
-          <w:lang w:val="en-US"/>
-        </w:rPr>
-        <w:t>z</w:t>
-      </w:r>
-      <w:r>
-        <w:rPr>
-          <w:sz w:val="28"/>
-          <w:szCs w:val="28"/>
-        </w:rPr>
-        <w:t>1 –</w:t>
-      </w:r>
-      <w:r>
-        <w:rPr>
-          <w:sz w:val="28"/>
-          <w:szCs w:val="28"/>
-        </w:rPr>
-        <w:t xml:space="preserve"> 7</w:t>
-      </w:r>
-      <w:r>
-        <w:rPr>
-          <w:sz w:val="28"/>
-          <w:szCs w:val="28"/>
-        </w:rPr>
-        <w:t xml:space="preserve">, </w:t>
-      </w:r>
-      <w:r>
-        <w:rPr>
-          <w:sz w:val="28"/>
-          <w:szCs w:val="28"/>
-          <w:lang w:val="en-US"/>
-        </w:rPr>
-        <w:t>x</w:t>
-      </w:r>
-      <w:r>
-        <w:rPr>
-          <w:sz w:val="28"/>
-          <w:szCs w:val="28"/>
-        </w:rPr>
-        <w:t>2 –</w:t>
-      </w:r>
-      <w:r>
-        <w:rPr>
-          <w:sz w:val="28"/>
-          <w:szCs w:val="28"/>
-        </w:rPr>
-        <w:t xml:space="preserve"> 11</w:t>
-      </w:r>
-      <w:r>
-        <w:rPr>
-          <w:sz w:val="28"/>
-          <w:szCs w:val="28"/>
-        </w:rPr>
-        <w:t xml:space="preserve">, </w:t>
-      </w:r>
-      <w:r>
-        <w:rPr>
-          <w:sz w:val="28"/>
-          <w:szCs w:val="28"/>
-          <w:lang w:val="en-US"/>
-        </w:rPr>
-        <w:t>y</w:t>
-      </w:r>
-      <w:r>
-        <w:rPr>
-          <w:sz w:val="28"/>
-          <w:szCs w:val="28"/>
-        </w:rPr>
-        <w:t>2 –</w:t>
-      </w:r>
-      <w:r>
-        <w:rPr>
-          <w:sz w:val="28"/>
-          <w:szCs w:val="28"/>
-        </w:rPr>
-        <w:t xml:space="preserve"> 17</w:t>
-      </w:r>
-      <w:r>
-        <w:rPr>
-          <w:sz w:val="28"/>
-          <w:szCs w:val="28"/>
-        </w:rPr>
-        <w:t xml:space="preserve">, </w:t>
-      </w:r>
-      <w:r>
-        <w:rPr>
-          <w:sz w:val="28"/>
-          <w:szCs w:val="28"/>
-          <w:lang w:val="en-US"/>
-        </w:rPr>
-        <w:t>z</w:t>
-      </w:r>
-      <w:r>
-        <w:rPr>
-          <w:sz w:val="28"/>
-          <w:szCs w:val="28"/>
-        </w:rPr>
-        <w:t>2 –</w:t>
-      </w:r>
-      <w:r>
-        <w:rPr>
-          <w:sz w:val="28"/>
-          <w:szCs w:val="28"/>
-        </w:rPr>
-        <w:t xml:space="preserve"> 18</w:t>
-      </w:r>
-      <w:r>
-        <w:rPr>
-          <w:sz w:val="28"/>
-          <w:szCs w:val="28"/>
-        </w:rPr>
-        <w:t xml:space="preserve">, </w:t>
-      </w:r>
-      <w:r>
-        <w:rPr>
-          <w:sz w:val="28"/>
-          <w:szCs w:val="28"/>
-          <w:lang w:val="en-US"/>
-        </w:rPr>
-        <w:t>x</w:t>
-      </w:r>
-      <w:r>
-        <w:rPr>
-          <w:sz w:val="28"/>
-          <w:szCs w:val="28"/>
-        </w:rPr>
-        <w:t>3 –</w:t>
-      </w:r>
-      <w:r>
-        <w:rPr>
-          <w:sz w:val="28"/>
-          <w:szCs w:val="28"/>
-        </w:rPr>
-        <w:t xml:space="preserve"> 8</w:t>
-      </w:r>
-      <w:r>
-        <w:rPr>
-          <w:sz w:val="28"/>
-          <w:szCs w:val="28"/>
-        </w:rPr>
-        <w:t xml:space="preserve">. </w:t>
-      </w:r>
-      <w:r>
-        <w:rPr>
-          <w:sz w:val="28"/>
-          <w:szCs w:val="28"/>
-          <w:lang w:val="en-US"/>
-        </w:rPr>
-        <w:t>y</w:t>
-      </w:r>
-      <w:r>
-        <w:rPr>
-          <w:sz w:val="28"/>
-          <w:szCs w:val="28"/>
-        </w:rPr>
-        <w:t>3 –</w:t>
-      </w:r>
-      <w:r>
-        <w:rPr>
-          <w:sz w:val="28"/>
-          <w:szCs w:val="28"/>
-        </w:rPr>
-        <w:t xml:space="preserve"> 1</w:t>
-      </w:r>
-      <w:r>
-        <w:rPr>
-          <w:sz w:val="28"/>
-          <w:szCs w:val="28"/>
-        </w:rPr>
-        <w:t xml:space="preserve">, </w:t>
-      </w:r>
-      <w:r>
-        <w:rPr>
-          <w:sz w:val="28"/>
-          <w:szCs w:val="28"/>
-          <w:lang w:val="en-US"/>
-        </w:rPr>
-        <w:t>z</w:t>
-      </w:r>
-      <w:r>
-        <w:rPr>
-          <w:sz w:val="28"/>
-          <w:szCs w:val="28"/>
-        </w:rPr>
-        <w:t>3 –</w:t>
-      </w:r>
-      <w:r>
-        <w:rPr>
-          <w:sz w:val="28"/>
-          <w:szCs w:val="28"/>
-        </w:rPr>
-        <w:t xml:space="preserve"> 7</w:t>
-      </w:r>
-      <w:r>
-        <w:rPr>
-          <w:sz w:val="28"/>
-          <w:szCs w:val="28"/>
-        </w:rPr>
-        <w:t xml:space="preserve">, </w:t>
-      </w:r>
-      <w:r>
-        <w:rPr>
-          <w:sz w:val="28"/>
-          <w:szCs w:val="28"/>
-          <w:lang w:val="en-US"/>
-        </w:rPr>
-        <w:t>x</w:t>
-      </w:r>
-      <w:r>
-        <w:rPr>
-          <w:sz w:val="28"/>
-          <w:szCs w:val="28"/>
-        </w:rPr>
-        <w:t>4 –</w:t>
-      </w:r>
-      <w:r>
-        <w:rPr>
-          <w:sz w:val="28"/>
-          <w:szCs w:val="28"/>
-        </w:rPr>
-        <w:t xml:space="preserve"> 15</w:t>
-      </w:r>
-      <w:r>
-        <w:rPr>
-          <w:sz w:val="28"/>
-          <w:szCs w:val="28"/>
-        </w:rPr>
-        <w:t xml:space="preserve">, </w:t>
-      </w:r>
-      <w:r>
-        <w:rPr>
-          <w:sz w:val="28"/>
-          <w:szCs w:val="28"/>
-          <w:lang w:val="en-US"/>
-        </w:rPr>
-        <w:t>y</w:t>
-      </w:r>
-      <w:r>
-        <w:rPr>
-          <w:sz w:val="28"/>
-          <w:szCs w:val="28"/>
-        </w:rPr>
-        <w:t>4 –</w:t>
-      </w:r>
-      <w:r>
-        <w:rPr>
-          <w:sz w:val="28"/>
-          <w:szCs w:val="28"/>
-        </w:rPr>
-        <w:t xml:space="preserve"> 19</w:t>
-      </w:r>
-      <w:r>
-        <w:rPr>
-          <w:sz w:val="28"/>
-          <w:szCs w:val="28"/>
-        </w:rPr>
-        <w:t xml:space="preserve">, </w:t>
-      </w:r>
-      <w:r>
-        <w:rPr>
-          <w:sz w:val="28"/>
-          <w:szCs w:val="28"/>
-          <w:lang w:val="en-US"/>
-        </w:rPr>
-        <w:t>z</w:t>
-      </w:r>
-      <w:r>
-        <w:rPr>
-          <w:sz w:val="28"/>
-          <w:szCs w:val="28"/>
-        </w:rPr>
-        <w:t>4 –</w:t>
-      </w:r>
-      <w:r>
-        <w:rPr>
-          <w:sz w:val="28"/>
-          <w:szCs w:val="28"/>
-        </w:rPr>
-        <w:t xml:space="preserve"> 8</w:t>
-      </w:r>
-      <w:r>
-        <w:rPr>
-          <w:sz w:val="28"/>
-          <w:szCs w:val="28"/>
-        </w:rPr>
         <w:t>.</w:t>
       </w:r>
-    </w:p>
-    <w:p>
-      <w:pPr>
-        <w:spacing w:line="360" w:lineRule="auto"/>
-        <w:jc w:val="center"/>
-        <w:rPr>
-          <w:sz w:val="28"/>
-          <w:szCs w:val="28"/>
-        </w:rPr>
-      </w:pPr>
-      <w:r>
-        <w:rPr>
-          <w:sz w:val="28"/>
-          <w:szCs w:val="28"/>
-        </w:rPr>
-        <w:t>ВЫПОЛНЕНИЕ РАБОТЫ:</w:t>
+      <w:r>
+        <w:rPr>
+          <w:sz w:val="28"/>
+          <w:szCs w:val="28"/>
+        </w:rPr>
+        <w:t>2</w:t>
+      </w:r>
+      <w:r>
+        <w:rPr>
+          <w:sz w:val="28"/>
+          <w:szCs w:val="28"/>
+        </w:rPr>
+        <w:t>.</w:t>
+      </w:r>
+      <w:r>
+        <w:rPr>
+          <w:sz w:val="28"/>
+          <w:szCs w:val="28"/>
+        </w:rPr>
+        <w:t xml:space="preserve"> Часть 1.</w:t>
+      </w:r>
+    </w:p>
+    <w:p>
+      <w:pPr>
+        <w:widowControl/>
+        <w:rPr>
+          <w:sz w:val="28"/>
+          <w:szCs w:val="28"/>
+        </w:rPr>
+      </w:pPr>
+      <w:r>
+        <w:rPr>
+          <w:sz w:val="28"/>
+          <w:szCs w:val="28"/>
+        </w:rPr>
+        <w:br w:type="page"/>
+      </w:r>
+    </w:p>
+    <w:p>
+      <w:pPr>
+        <w:spacing w:line="360" w:lineRule="auto"/>
+        <w:jc w:val="center"/>
+        <w:rPr>
+          <w:sz w:val="28"/>
+          <w:szCs w:val="28"/>
+        </w:rPr>
+      </w:pPr>
+      <w:r>
+        <w:rPr>
+          <w:sz w:val="28"/>
+          <w:szCs w:val="28"/>
+        </w:rPr>
+        <w:lastRenderedPageBreak/>
+        <w:drawing>
+          <wp:inline distT="0" distB="0" distL="0" distR="0" wp14:anchorId="08BCFC38" wp14:editId="13F8D171">
+            <wp:extent cx="3119896" cy="2762250"/>
+            <wp:effectExtent l="0" t="0" r="0" b="0"/>
+            <wp:docPr id="3" name="Рисунок 3"/>
+            <wp:cNvGraphicFramePr>
+              <a:graphicFrameLocks xmlns:a="http://schemas.openxmlformats.org/drawingml/2006/main" noChangeAspect="1"/>
+            </wp:cNvGraphicFramePr>
+            <a:graphic xmlns:a="http://schemas.openxmlformats.org/drawingml/2006/main">
+              <a:graphicData uri="http://schemas.openxmlformats.org/drawingml/2006/picture">
+                <pic:pic xmlns:pic="http://schemas.openxmlformats.org/drawingml/2006/picture">
+                  <pic:nvPicPr>
+                    <pic:cNvPr id="1" name=""/>
+                    <pic:cNvPicPr/>
+                  </pic:nvPicPr>
+                  <pic:blipFill>
+                    <a:blip r:embed="rId8"/>
+                    <a:stretch>
+                      <a:fillRect/>
+                    </a:stretch>
+                  </pic:blipFill>
+                  <pic:spPr>
+                    <a:xfrm>
+                      <a:off x="0" y="0"/>
+                      <a:ext cx="3128579" cy="2769938"/>
+                    </a:xfrm>
+                    <a:prstGeom prst="rect">
+                      <a:avLst/>
+                    </a:prstGeom>
+                  </pic:spPr>
+                </pic:pic>
+              </a:graphicData>
+            </a:graphic>
+          </wp:inline>
+        </w:drawing>
+      </w:r>
+    </w:p>
+    <w:p>
+      <w:pPr>
+        <w:spacing w:line="360" w:lineRule="auto"/>
+        <w:jc w:val="center"/>
+        <w:rPr>
+          <w:sz w:val="28"/>
+          <w:szCs w:val="28"/>
+        </w:rPr>
+      </w:pPr>
+      <w:r>
+        <w:rPr>
+          <w:sz w:val="28"/>
+          <w:szCs w:val="28"/>
+        </w:rPr>
+        <w:t xml:space="preserve">Рисунок </w:t>
+      </w:r>
+      <w:r>
+        <w:rPr>
+          <w:sz w:val="28"/>
+          <w:szCs w:val="28"/>
+        </w:rPr>
+        <w:t>3</w:t>
+      </w:r>
+      <w:r>
+        <w:rPr>
+          <w:sz w:val="28"/>
+          <w:szCs w:val="28"/>
+        </w:rPr>
+        <w:t>. Выполнение пример 3.</w:t>
+      </w:r>
+      <w:r>
+        <w:rPr>
+          <w:sz w:val="28"/>
+          <w:szCs w:val="28"/>
+        </w:rPr>
+        <w:t>2</w:t>
+      </w:r>
+      <w:r>
+        <w:rPr>
+          <w:sz w:val="28"/>
+          <w:szCs w:val="28"/>
+        </w:rPr>
+        <w:t xml:space="preserve">. Часть </w:t>
+      </w:r>
+      <w:r>
+        <w:rPr>
+          <w:sz w:val="28"/>
+          <w:szCs w:val="28"/>
+        </w:rPr>
+        <w:t>2</w:t>
+      </w:r>
+      <w:r>
+        <w:rPr>
+          <w:sz w:val="28"/>
+          <w:szCs w:val="28"/>
+        </w:rPr>
+        <w:t>.</w:t>
       </w:r>
     </w:p>
     <w:p>
@@ -1520,6 +1450,72 @@
         <w:ind w:firstLine="709"/>
         <w:jc w:val="both"/>
         <w:rPr>
+          <w:b/>
+          <w:bCs/>
+          <w:sz w:val="28"/>
+          <w:szCs w:val="28"/>
+        </w:rPr>
+      </w:pPr>
+      <w:r>
+        <w:rPr>
+          <w:b/>
+          <w:bCs/>
+          <w:sz w:val="28"/>
+          <w:szCs w:val="28"/>
+        </w:rPr>
+        <w:t xml:space="preserve">Пример </w:t>
+      </w:r>
+      <w:r>
+        <w:rPr>
+          <w:b/>
+          <w:bCs/>
+          <w:sz w:val="28"/>
+          <w:szCs w:val="28"/>
+        </w:rPr>
+        <w:t>3</w:t>
+      </w:r>
+      <w:r>
+        <w:rPr>
+          <w:b/>
+          <w:bCs/>
+          <w:sz w:val="28"/>
+          <w:szCs w:val="28"/>
+        </w:rPr>
+        <w:t>.</w:t>
+      </w:r>
+      <w:r>
+        <w:rPr>
+          <w:b/>
+          <w:bCs/>
+          <w:sz w:val="28"/>
+          <w:szCs w:val="28"/>
+        </w:rPr>
+        <w:t>3</w:t>
+      </w:r>
+      <w:r>
+        <w:rPr>
+          <w:b/>
+          <w:bCs/>
+          <w:sz w:val="28"/>
+          <w:szCs w:val="28"/>
+        </w:rPr>
+        <w:t>.</w:t>
+      </w:r>
+      <w:r>
+        <w:rPr>
+          <w:b/>
+          <w:bCs/>
+          <w:sz w:val="28"/>
+          <w:szCs w:val="28"/>
+        </w:rPr>
+        <w:t xml:space="preserve"> </w:t>
+      </w:r>
+    </w:p>
+    <w:p>
+      <w:pPr>
+        <w:spacing w:line="360" w:lineRule="auto"/>
+        <w:jc w:val="center"/>
+        <w:rPr>
           <w:sz w:val="28"/>
           <w:szCs w:val="28"/>
           <w:lang w:val="en-US"/>
@@ -1527,10 +1523,117 @@
       </w:pPr>
       <w:r>
         <w:rPr>
-          <w:sz w:val="28"/>
-          <w:szCs w:val="28"/>
-        </w:rPr>
-        <w:t>Для выполнения данного задания было выполнено несколько примеров, которые продемонстрированы в методическом указании.</w:t>
+          <w:noProof/>
+          <w:sz w:val="28"/>
+          <w:szCs w:val="28"/>
+          <w:lang w:val="en-US"/>
+        </w:rPr>
+        <w:drawing>
+          <wp:inline distT="0" distB="0" distL="0" distR="0" wp14:anchorId="7810F91C" wp14:editId="5B964755">
+            <wp:extent cx="5937250" cy="1358900"/>
+            <wp:effectExtent l="0" t="0" r="0" b="0"/>
+            <wp:docPr id="4" name="Рисунок 4"/>
+            <wp:cNvGraphicFramePr>
+              <a:graphicFrameLocks xmlns:a="http://schemas.openxmlformats.org/drawingml/2006/main" noChangeAspect="1"/>
+            </wp:cNvGraphicFramePr>
+            <a:graphic xmlns:a="http://schemas.openxmlformats.org/drawingml/2006/main">
+              <a:graphicData uri="http://schemas.openxmlformats.org/drawingml/2006/picture">
+                <pic:pic xmlns:pic="http://schemas.openxmlformats.org/drawingml/2006/picture">
+                  <pic:nvPicPr>
+                    <pic:cNvPr id="0" name="Picture 1"/>
+                    <pic:cNvPicPr>
+                      <a:picLocks noChangeAspect="1" noChangeArrowheads="1"/>
+                    </pic:cNvPicPr>
+                  </pic:nvPicPr>
+                  <pic:blipFill>
+                    <a:blip r:embed="rId9" cstate="print">
+                      <a:extLst>
+                        <a:ext uri="{28A0092B-C50C-407E-A947-70E740481C1C}">
+                          <a14:useLocalDpi xmlns:a14="http://schemas.microsoft.com/office/drawing/2010/main" val="0"/>
+                        </a:ext>
+                      </a:extLst>
+                    </a:blip>
+                    <a:srcRect/>
+                    <a:stretch>
+                      <a:fillRect/>
+                    </a:stretch>
+                  </pic:blipFill>
+                  <pic:spPr bwMode="auto">
+                    <a:xfrm>
+                      <a:off x="0" y="0"/>
+                      <a:ext cx="5937250" cy="1358900"/>
+                    </a:xfrm>
+                    <a:prstGeom prst="rect">
+                      <a:avLst/>
+                    </a:prstGeom>
+                    <a:noFill/>
+                    <a:ln>
+                      <a:noFill/>
+                    </a:ln>
+                  </pic:spPr>
+                </pic:pic>
+              </a:graphicData>
+            </a:graphic>
+          </wp:inline>
+        </w:drawing>
+      </w:r>
+    </w:p>
+    <w:p>
+      <w:pPr>
+        <w:spacing w:line="360" w:lineRule="auto"/>
+        <w:jc w:val="center"/>
+        <w:rPr>
+          <w:sz w:val="28"/>
+          <w:szCs w:val="28"/>
+        </w:rPr>
+      </w:pPr>
+      <w:r>
+        <w:rPr>
+          <w:sz w:val="28"/>
+          <w:szCs w:val="28"/>
+        </w:rPr>
+        <w:t xml:space="preserve">Рисунок </w:t>
+      </w:r>
+      <w:r>
+        <w:rPr>
+          <w:sz w:val="28"/>
+          <w:szCs w:val="28"/>
+        </w:rPr>
+        <w:t>4</w:t>
+      </w:r>
+      <w:r>
+        <w:rPr>
+          <w:sz w:val="28"/>
+          <w:szCs w:val="28"/>
+        </w:rPr>
+        <w:t>. Выполнение пример 3.3.</w:t>
+      </w:r>
+    </w:p>
+    <w:p>
+      <w:pPr>
+        <w:spacing w:line="360" w:lineRule="auto"/>
+        <w:jc w:val="center"/>
+        <w:rPr>
+          <w:sz w:val="28"/>
+          <w:szCs w:val="28"/>
+        </w:rPr>
+      </w:pPr>
+    </w:p>
+    <w:p>
+      <w:pPr>
+        <w:spacing w:line="360" w:lineRule="auto"/>
+        <w:jc w:val="center"/>
+        <w:rPr>
+          <w:sz w:val="28"/>
+          <w:szCs w:val="28"/>
+        </w:rPr>
+      </w:pPr>
+      <w:r>
+        <w:rPr>
+          <w:sz w:val="28"/>
+          <w:szCs w:val="28"/>
+        </w:rPr>
+        <w:t>ЗАДАНИЕ 2 (вариант 14).</w:t>
       </w:r>
     </w:p>
     <w:p>
@@ -1541,39 +1644,253 @@
         <w:rPr>
           <w:sz w:val="28"/>
           <w:szCs w:val="28"/>
+        </w:rPr>
+      </w:pPr>
+      <w:r>
+        <w:rPr>
+          <w:sz w:val="28"/>
+          <w:szCs w:val="28"/>
+        </w:rPr>
+        <w:t>Построить в пространстве каркасную треугольную пирамиду, заданную координатами вершин</w:t>
+      </w:r>
+      <w:r>
+        <w:rPr>
+          <w:sz w:val="28"/>
+          <w:szCs w:val="28"/>
+        </w:rPr>
+        <w:t xml:space="preserve"> </w:t>
+      </w:r>
+      <w:r>
+        <w:rPr>
+          <w:sz w:val="28"/>
+          <w:szCs w:val="28"/>
           <w:lang w:val="en-US"/>
         </w:rPr>
-      </w:pPr>
-    </w:p>
-    <w:p>
-      <w:pPr>
-        <w:spacing w:line="360" w:lineRule="auto"/>
-        <w:jc w:val="center"/>
-        <w:rPr>
-          <w:sz w:val="28"/>
-          <w:szCs w:val="28"/>
-        </w:rPr>
-      </w:pPr>
-      <w:r>
-        <w:rPr>
-          <w:sz w:val="28"/>
-          <w:szCs w:val="28"/>
-        </w:rPr>
-        <w:t xml:space="preserve">ЗАДАНИЕ </w:t>
-      </w:r>
-      <w:r>
-        <w:rPr>
-          <w:sz w:val="28"/>
-          <w:szCs w:val="28"/>
-        </w:rPr>
-        <w:t>3</w:t>
-      </w:r>
-      <w:r>
-        <w:rPr>
-          <w:sz w:val="28"/>
-          <w:szCs w:val="28"/>
-        </w:rPr>
-        <w:t xml:space="preserve"> (вариант 14).</w:t>
+        <w:t>x</w:t>
+      </w:r>
+      <w:r>
+        <w:rPr>
+          <w:sz w:val="28"/>
+          <w:szCs w:val="28"/>
+        </w:rPr>
+        <w:t xml:space="preserve">1 </w:t>
+      </w:r>
+      <w:r>
+        <w:rPr>
+          <w:sz w:val="28"/>
+          <w:szCs w:val="28"/>
+        </w:rPr>
+        <w:t xml:space="preserve">– </w:t>
+      </w:r>
+      <w:r>
+        <w:rPr>
+          <w:sz w:val="28"/>
+          <w:szCs w:val="28"/>
+        </w:rPr>
+        <w:t xml:space="preserve">6, </w:t>
+      </w:r>
+      <w:r>
+        <w:rPr>
+          <w:sz w:val="28"/>
+          <w:szCs w:val="28"/>
+          <w:lang w:val="en-US"/>
+        </w:rPr>
+        <w:t>y</w:t>
+      </w:r>
+      <w:r>
+        <w:rPr>
+          <w:sz w:val="28"/>
+          <w:szCs w:val="28"/>
+        </w:rPr>
+        <w:t xml:space="preserve">1 </w:t>
+      </w:r>
+      <w:r>
+        <w:rPr>
+          <w:sz w:val="28"/>
+          <w:szCs w:val="28"/>
+        </w:rPr>
+        <w:t>–</w:t>
+      </w:r>
+      <w:r>
+        <w:rPr>
+          <w:sz w:val="28"/>
+          <w:szCs w:val="28"/>
+        </w:rPr>
+        <w:t xml:space="preserve"> 3, </w:t>
+      </w:r>
+      <w:r>
+        <w:rPr>
+          <w:sz w:val="28"/>
+          <w:szCs w:val="28"/>
+          <w:lang w:val="en-US"/>
+        </w:rPr>
+        <w:t>z</w:t>
+      </w:r>
+      <w:r>
+        <w:rPr>
+          <w:sz w:val="28"/>
+          <w:szCs w:val="28"/>
+        </w:rPr>
+        <w:t xml:space="preserve">1 – 7, </w:t>
+      </w:r>
+      <w:r>
+        <w:rPr>
+          <w:sz w:val="28"/>
+          <w:szCs w:val="28"/>
+          <w:lang w:val="en-US"/>
+        </w:rPr>
+        <w:t>x</w:t>
+      </w:r>
+      <w:r>
+        <w:rPr>
+          <w:sz w:val="28"/>
+          <w:szCs w:val="28"/>
+        </w:rPr>
+        <w:t xml:space="preserve">2 – 11, </w:t>
+      </w:r>
+      <w:r>
+        <w:rPr>
+          <w:sz w:val="28"/>
+          <w:szCs w:val="28"/>
+          <w:lang w:val="en-US"/>
+        </w:rPr>
+        <w:t>y</w:t>
+      </w:r>
+      <w:r>
+        <w:rPr>
+          <w:sz w:val="28"/>
+          <w:szCs w:val="28"/>
+        </w:rPr>
+        <w:t xml:space="preserve">2 – 17, </w:t>
+      </w:r>
+      <w:r>
+        <w:rPr>
+          <w:sz w:val="28"/>
+          <w:szCs w:val="28"/>
+          <w:lang w:val="en-US"/>
+        </w:rPr>
+        <w:t>z</w:t>
+      </w:r>
+      <w:r>
+        <w:rPr>
+          <w:sz w:val="28"/>
+          <w:szCs w:val="28"/>
+        </w:rPr>
+        <w:t xml:space="preserve">2 – 18, </w:t>
+      </w:r>
+      <w:r>
+        <w:rPr>
+          <w:sz w:val="28"/>
+          <w:szCs w:val="28"/>
+          <w:lang w:val="en-US"/>
+        </w:rPr>
+        <w:t>x</w:t>
+      </w:r>
+      <w:r>
+        <w:rPr>
+          <w:sz w:val="28"/>
+          <w:szCs w:val="28"/>
+        </w:rPr>
+        <w:t xml:space="preserve">3 – 8. </w:t>
+      </w:r>
+      <w:r>
+        <w:rPr>
+          <w:sz w:val="28"/>
+          <w:szCs w:val="28"/>
+          <w:lang w:val="en-US"/>
+        </w:rPr>
+        <w:t>y</w:t>
+      </w:r>
+      <w:r>
+        <w:rPr>
+          <w:sz w:val="28"/>
+          <w:szCs w:val="28"/>
+        </w:rPr>
+        <w:t xml:space="preserve">3 – 1, </w:t>
+      </w:r>
+      <w:r>
+        <w:rPr>
+          <w:sz w:val="28"/>
+          <w:szCs w:val="28"/>
+          <w:lang w:val="en-US"/>
+        </w:rPr>
+        <w:t>z</w:t>
+      </w:r>
+      <w:r>
+        <w:rPr>
+          <w:sz w:val="28"/>
+          <w:szCs w:val="28"/>
+        </w:rPr>
+        <w:t xml:space="preserve">3 – 7, </w:t>
+      </w:r>
+      <w:r>
+        <w:rPr>
+          <w:sz w:val="28"/>
+          <w:szCs w:val="28"/>
+          <w:lang w:val="en-US"/>
+        </w:rPr>
+        <w:t>x</w:t>
+      </w:r>
+      <w:r>
+        <w:rPr>
+          <w:sz w:val="28"/>
+          <w:szCs w:val="28"/>
+        </w:rPr>
+        <w:t xml:space="preserve">4 – 15, </w:t>
+      </w:r>
+      <w:r>
+        <w:rPr>
+          <w:sz w:val="28"/>
+          <w:szCs w:val="28"/>
+          <w:lang w:val="en-US"/>
+        </w:rPr>
+        <w:t>y</w:t>
+      </w:r>
+      <w:r>
+        <w:rPr>
+          <w:sz w:val="28"/>
+          <w:szCs w:val="28"/>
+        </w:rPr>
+        <w:t xml:space="preserve">4 – 19, </w:t>
+      </w:r>
+      <w:r>
+        <w:rPr>
+          <w:sz w:val="28"/>
+          <w:szCs w:val="28"/>
+          <w:lang w:val="en-US"/>
+        </w:rPr>
+        <w:t>z</w:t>
+      </w:r>
+      <w:r>
+        <w:rPr>
+          <w:sz w:val="28"/>
+          <w:szCs w:val="28"/>
+        </w:rPr>
+        <w:t>4 – 8</w:t>
+      </w:r>
+      <w:r>
+        <w:rPr>
+          <w:sz w:val="28"/>
+          <w:szCs w:val="28"/>
+        </w:rPr>
+        <w:t>.</w:t>
+      </w:r>
+    </w:p>
+    <w:p>
+      <w:pPr>
+        <w:spacing w:line="360" w:lineRule="auto"/>
+        <w:jc w:val="center"/>
+        <w:rPr>
+          <w:sz w:val="28"/>
+          <w:szCs w:val="28"/>
+        </w:rPr>
+      </w:pPr>
+      <w:r>
+        <w:rPr>
+          <w:sz w:val="28"/>
+          <w:szCs w:val="28"/>
+        </w:rPr>
+        <w:t>ВЫПОЛНЕНИЕ РАБОТЫ:</w:t>
       </w:r>
     </w:p>
     <w:p>
@@ -1591,24 +1908,117 @@
           <w:sz w:val="28"/>
           <w:szCs w:val="28"/>
         </w:rPr>
-        <w:t>Выбрать в построенной каркасной пирамиде два противоположных ребра. Выделить их цветом. Построить для них взаимный перпендикуляр</w:t>
-      </w:r>
-    </w:p>
-    <w:p>
-      <w:pPr>
-        <w:spacing w:line="360" w:lineRule="auto"/>
-        <w:jc w:val="center"/>
-        <w:rPr>
-          <w:sz w:val="28"/>
-          <w:szCs w:val="28"/>
-        </w:rPr>
-      </w:pPr>
-      <w:r>
-        <w:rPr>
-          <w:sz w:val="28"/>
-          <w:szCs w:val="28"/>
-        </w:rPr>
-        <w:t>ВЫПОЛНЕНИЕ РАБОТЫ:</w:t>
+        <w:t>Для выполнения данного задания было выполнено несколько примеров, которые продемонстрированы в методическом указании.</w:t>
+      </w:r>
+    </w:p>
+    <w:p>
+      <w:pPr>
+        <w:spacing w:line="360" w:lineRule="auto"/>
+        <w:jc w:val="center"/>
+        <w:rPr>
+          <w:sz w:val="28"/>
+          <w:szCs w:val="28"/>
+        </w:rPr>
+      </w:pPr>
+      <w:r>
+        <w:rPr>
+          <w:sz w:val="28"/>
+          <w:szCs w:val="28"/>
+        </w:rPr>
+        <w:lastRenderedPageBreak/>
+        <w:drawing>
+          <wp:inline distT="0" distB="0" distL="0" distR="0" wp14:anchorId="339A6B90" wp14:editId="088823A3">
+            <wp:extent cx="5194300" cy="4597414"/>
+            <wp:effectExtent l="0" t="0" r="0" b="0"/>
+            <wp:docPr id="5" name="Рисунок 5"/>
+            <wp:cNvGraphicFramePr>
+              <a:graphicFrameLocks xmlns:a="http://schemas.openxmlformats.org/drawingml/2006/main" noChangeAspect="1"/>
+            </wp:cNvGraphicFramePr>
+            <a:graphic xmlns:a="http://schemas.openxmlformats.org/drawingml/2006/main">
+              <a:graphicData uri="http://schemas.openxmlformats.org/drawingml/2006/picture">
+                <pic:pic xmlns:pic="http://schemas.openxmlformats.org/drawingml/2006/picture">
+                  <pic:nvPicPr>
+                    <pic:cNvPr id="1" name=""/>
+                    <pic:cNvPicPr/>
+                  </pic:nvPicPr>
+                  <pic:blipFill>
+                    <a:blip r:embed="rId10"/>
+                    <a:stretch>
+                      <a:fillRect/>
+                    </a:stretch>
+                  </pic:blipFill>
+                  <pic:spPr>
+                    <a:xfrm>
+                      <a:off x="0" y="0"/>
+                      <a:ext cx="5196998" cy="4599802"/>
+                    </a:xfrm>
+                    <a:prstGeom prst="rect">
+                      <a:avLst/>
+                    </a:prstGeom>
+                  </pic:spPr>
+                </pic:pic>
+              </a:graphicData>
+            </a:graphic>
+          </wp:inline>
+        </w:drawing>
+      </w:r>
+    </w:p>
+    <w:p>
+      <w:pPr>
+        <w:spacing w:line="360" w:lineRule="auto"/>
+        <w:jc w:val="center"/>
+        <w:rPr>
+          <w:sz w:val="28"/>
+          <w:szCs w:val="28"/>
+        </w:rPr>
+      </w:pPr>
+      <w:r>
+        <w:rPr>
+          <w:sz w:val="28"/>
+          <w:szCs w:val="28"/>
+        </w:rPr>
+        <w:t>Рисунок 5. Выполнение задания 2.</w:t>
+      </w:r>
+    </w:p>
+    <w:p>
+      <w:pPr>
+        <w:spacing w:line="360" w:lineRule="auto"/>
+        <w:jc w:val="center"/>
+        <w:rPr>
+          <w:sz w:val="28"/>
+          <w:szCs w:val="28"/>
+        </w:rPr>
+      </w:pPr>
+    </w:p>
+    <w:p>
+      <w:pPr>
+        <w:spacing w:line="360" w:lineRule="auto"/>
+        <w:jc w:val="center"/>
+        <w:rPr>
+          <w:sz w:val="28"/>
+          <w:szCs w:val="28"/>
+        </w:rPr>
+      </w:pPr>
+      <w:r>
+        <w:rPr>
+          <w:sz w:val="28"/>
+          <w:szCs w:val="28"/>
+        </w:rPr>
+        <w:t xml:space="preserve">ЗАДАНИЕ </w:t>
+      </w:r>
+      <w:r>
+        <w:rPr>
+          <w:sz w:val="28"/>
+          <w:szCs w:val="28"/>
+        </w:rPr>
+        <w:t>3</w:t>
+      </w:r>
+      <w:r>
+        <w:rPr>
+          <w:sz w:val="28"/>
+          <w:szCs w:val="28"/>
+        </w:rPr>
+        <w:t xml:space="preserve"> (вариант 14).</w:t>
       </w:r>
     </w:p>
     <w:p>
@@ -1626,49 +2036,24 @@
           <w:sz w:val="28"/>
           <w:szCs w:val="28"/>
         </w:rPr>
-        <w:t>Для выполнения данного задания было выполнено несколько примеров, которые продемонстрированы в методическом указании.</w:t>
-      </w:r>
-    </w:p>
-    <w:p>
-      <w:pPr>
-        <w:spacing w:line="360" w:lineRule="auto"/>
-        <w:jc w:val="center"/>
-        <w:rPr>
-          <w:sz w:val="28"/>
-          <w:szCs w:val="28"/>
-        </w:rPr>
-      </w:pPr>
-    </w:p>
-    <w:p>
-      <w:pPr>
-        <w:spacing w:line="360" w:lineRule="auto"/>
-        <w:jc w:val="center"/>
-        <w:rPr>
-          <w:sz w:val="28"/>
-          <w:szCs w:val="28"/>
-        </w:rPr>
-      </w:pPr>
-      <w:r>
-        <w:rPr>
-          <w:sz w:val="28"/>
-          <w:szCs w:val="28"/>
-        </w:rPr>
-        <w:lastRenderedPageBreak/>
-        <w:t xml:space="preserve">ЗАДАНИЕ </w:t>
-      </w:r>
-      <w:r>
-        <w:rPr>
-          <w:sz w:val="28"/>
-          <w:szCs w:val="28"/>
-        </w:rPr>
-        <w:t>4</w:t>
-      </w:r>
-      <w:r>
-        <w:rPr>
-          <w:sz w:val="28"/>
-          <w:szCs w:val="28"/>
-        </w:rPr>
-        <w:t xml:space="preserve"> (вариант 14).</w:t>
+        <w:t>Выбрать в построенной каркасной пирамиде два противоположных ребра. Выделить их цветом. Построить для них взаимный перпендикуляр</w:t>
+      </w:r>
+    </w:p>
+    <w:p>
+      <w:pPr>
+        <w:spacing w:line="360" w:lineRule="auto"/>
+        <w:jc w:val="center"/>
+        <w:rPr>
+          <w:sz w:val="28"/>
+          <w:szCs w:val="28"/>
+        </w:rPr>
+      </w:pPr>
+      <w:r>
+        <w:rPr>
+          <w:sz w:val="28"/>
+          <w:szCs w:val="28"/>
+        </w:rPr>
+        <w:t>ВЫПОЛНЕНИЕ РАБОТЫ:</w:t>
       </w:r>
     </w:p>
     <w:p>
@@ -1686,24 +2071,202 @@
           <w:sz w:val="28"/>
           <w:szCs w:val="28"/>
         </w:rPr>
-        <w:t>Для одной из вершин построенной каркасной пирамиды построить отрезок прямой, проходящей через данную вершину и параллельный одному из рёбер пирамиды.</w:t>
-      </w:r>
-    </w:p>
-    <w:p>
-      <w:pPr>
-        <w:spacing w:line="360" w:lineRule="auto"/>
-        <w:jc w:val="center"/>
-        <w:rPr>
-          <w:sz w:val="28"/>
-          <w:szCs w:val="28"/>
-        </w:rPr>
-      </w:pPr>
-      <w:r>
-        <w:rPr>
-          <w:sz w:val="28"/>
-          <w:szCs w:val="28"/>
-        </w:rPr>
-        <w:t>ВЫПОЛНЕНИЕ РАБОТЫ:</w:t>
+        <w:t>Для выполнения данного задания было выполнено несколько примеров, которые продемонстрированы в методическом указании.</w:t>
+      </w:r>
+    </w:p>
+    <w:p>
+      <w:pPr>
+        <w:spacing w:line="360" w:lineRule="auto"/>
+        <w:jc w:val="center"/>
+        <w:rPr>
+          <w:sz w:val="28"/>
+          <w:szCs w:val="28"/>
+        </w:rPr>
+      </w:pPr>
+      <w:r>
+        <w:rPr>
+          <w:sz w:val="28"/>
+          <w:szCs w:val="28"/>
+        </w:rPr>
+        <w:lastRenderedPageBreak/>
+        <w:drawing>
+          <wp:inline distT="0" distB="0" distL="0" distR="0" wp14:anchorId="0F413528" wp14:editId="78000C67">
+            <wp:extent cx="4425950" cy="4541812"/>
+            <wp:effectExtent l="0" t="0" r="0" b="0"/>
+            <wp:docPr id="6" name="Рисунок 6"/>
+            <wp:cNvGraphicFramePr>
+              <a:graphicFrameLocks xmlns:a="http://schemas.openxmlformats.org/drawingml/2006/main" noChangeAspect="1"/>
+            </wp:cNvGraphicFramePr>
+            <a:graphic xmlns:a="http://schemas.openxmlformats.org/drawingml/2006/main">
+              <a:graphicData uri="http://schemas.openxmlformats.org/drawingml/2006/picture">
+                <pic:pic xmlns:pic="http://schemas.openxmlformats.org/drawingml/2006/picture">
+                  <pic:nvPicPr>
+                    <pic:cNvPr id="1" name=""/>
+                    <pic:cNvPicPr/>
+                  </pic:nvPicPr>
+                  <pic:blipFill>
+                    <a:blip r:embed="rId11"/>
+                    <a:stretch>
+                      <a:fillRect/>
+                    </a:stretch>
+                  </pic:blipFill>
+                  <pic:spPr>
+                    <a:xfrm>
+                      <a:off x="0" y="0"/>
+                      <a:ext cx="4429266" cy="4545215"/>
+                    </a:xfrm>
+                    <a:prstGeom prst="rect">
+                      <a:avLst/>
+                    </a:prstGeom>
+                  </pic:spPr>
+                </pic:pic>
+              </a:graphicData>
+            </a:graphic>
+          </wp:inline>
+        </w:drawing>
+      </w:r>
+    </w:p>
+    <w:p>
+      <w:pPr>
+        <w:spacing w:line="360" w:lineRule="auto"/>
+        <w:jc w:val="center"/>
+        <w:rPr>
+          <w:sz w:val="28"/>
+          <w:szCs w:val="28"/>
+        </w:rPr>
+      </w:pPr>
+      <w:r>
+        <w:rPr>
+          <w:sz w:val="28"/>
+          <w:szCs w:val="28"/>
+        </w:rPr>
+        <w:t>Рисунок 6. Выполнение задания 3. Часть 1.</w:t>
+      </w:r>
+    </w:p>
+    <w:p>
+      <w:pPr>
+        <w:spacing w:line="360" w:lineRule="auto"/>
+        <w:jc w:val="center"/>
+        <w:rPr>
+          <w:sz w:val="28"/>
+          <w:szCs w:val="28"/>
+        </w:rPr>
+      </w:pPr>
+    </w:p>
+    <w:p>
+      <w:pPr>
+        <w:spacing w:line="360" w:lineRule="auto"/>
+        <w:jc w:val="center"/>
+        <w:rPr>
+          <w:sz w:val="28"/>
+          <w:szCs w:val="28"/>
+        </w:rPr>
+      </w:pPr>
+      <w:r>
+        <w:rPr>
+          <w:sz w:val="28"/>
+          <w:szCs w:val="28"/>
+        </w:rPr>
+        <w:drawing>
+          <wp:inline distT="0" distB="0" distL="0" distR="0" wp14:anchorId="36451E9B" wp14:editId="794C6934">
+            <wp:extent cx="2787650" cy="2648267"/>
+            <wp:effectExtent l="0" t="0" r="0" b="0"/>
+            <wp:docPr id="7" name="Рисунок 7"/>
+            <wp:cNvGraphicFramePr>
+              <a:graphicFrameLocks xmlns:a="http://schemas.openxmlformats.org/drawingml/2006/main" noChangeAspect="1"/>
+            </wp:cNvGraphicFramePr>
+            <a:graphic xmlns:a="http://schemas.openxmlformats.org/drawingml/2006/main">
+              <a:graphicData uri="http://schemas.openxmlformats.org/drawingml/2006/picture">
+                <pic:pic xmlns:pic="http://schemas.openxmlformats.org/drawingml/2006/picture">
+                  <pic:nvPicPr>
+                    <pic:cNvPr id="1" name=""/>
+                    <pic:cNvPicPr/>
+                  </pic:nvPicPr>
+                  <pic:blipFill rotWithShape="1">
+                    <a:blip r:embed="rId12"/>
+                    <a:srcRect l="2118" t="3558" r="2275" b="-1"/>
+                    <a:stretch/>
+                  </pic:blipFill>
+                  <pic:spPr bwMode="auto">
+                    <a:xfrm>
+                      <a:off x="0" y="0"/>
+                      <a:ext cx="2791605" cy="2652024"/>
+                    </a:xfrm>
+                    <a:prstGeom prst="rect">
+                      <a:avLst/>
+                    </a:prstGeom>
+                    <a:ln>
+                      <a:noFill/>
+                    </a:ln>
+                    <a:extLst>
+                      <a:ext uri="{53640926-AAD7-44D8-BBD7-CCE9431645EC}">
+                        <a14:shadowObscured xmlns:a14="http://schemas.microsoft.com/office/drawing/2010/main"/>
+                      </a:ext>
+                    </a:extLst>
+                  </pic:spPr>
+                </pic:pic>
+              </a:graphicData>
+            </a:graphic>
+          </wp:inline>
+        </w:drawing>
+      </w:r>
+    </w:p>
+    <w:p>
+      <w:pPr>
+        <w:spacing w:line="360" w:lineRule="auto"/>
+        <w:jc w:val="center"/>
+        <w:rPr>
+          <w:sz w:val="28"/>
+          <w:szCs w:val="28"/>
+        </w:rPr>
+      </w:pPr>
+      <w:r>
+        <w:rPr>
+          <w:sz w:val="28"/>
+          <w:szCs w:val="28"/>
+        </w:rPr>
+        <w:t>Рисунок 7. Выполнение задания 3. Часть 2.</w:t>
+      </w:r>
+    </w:p>
+    <w:p>
+      <w:pPr>
+        <w:spacing w:line="360" w:lineRule="auto"/>
+        <w:jc w:val="center"/>
+        <w:rPr>
+          <w:sz w:val="28"/>
+          <w:szCs w:val="28"/>
+        </w:rPr>
+      </w:pPr>
+    </w:p>
+    <w:p>
+      <w:pPr>
+        <w:spacing w:line="360" w:lineRule="auto"/>
+        <w:jc w:val="center"/>
+        <w:rPr>
+          <w:sz w:val="28"/>
+          <w:szCs w:val="28"/>
+        </w:rPr>
+      </w:pPr>
+      <w:r>
+        <w:rPr>
+          <w:sz w:val="28"/>
+          <w:szCs w:val="28"/>
+        </w:rPr>
+        <w:t xml:space="preserve">ЗАДАНИЕ </w:t>
+      </w:r>
+      <w:r>
+        <w:rPr>
+          <w:sz w:val="28"/>
+          <w:szCs w:val="28"/>
+        </w:rPr>
+        <w:t>4</w:t>
+      </w:r>
+      <w:r>
+        <w:rPr>
+          <w:sz w:val="28"/>
+          <w:szCs w:val="28"/>
+        </w:rPr>
+        <w:t xml:space="preserve"> (вариант 14).</w:t>
       </w:r>
     </w:p>
     <w:p>
@@ -1721,49 +2284,32 @@
           <w:sz w:val="28"/>
           <w:szCs w:val="28"/>
         </w:rPr>
-        <w:t>Для выполнения данного задания было выполнено несколько примеров, которые продемонстрированы в методическом указании.</w:t>
-      </w:r>
-    </w:p>
-    <w:p>
-      <w:pPr>
-        <w:spacing w:line="360" w:lineRule="auto"/>
-        <w:jc w:val="center"/>
-        <w:rPr>
-          <w:sz w:val="28"/>
-          <w:szCs w:val="28"/>
-          <w:lang w:val="en-US"/>
-        </w:rPr>
-      </w:pPr>
-    </w:p>
-    <w:p>
-      <w:pPr>
-        <w:spacing w:line="360" w:lineRule="auto"/>
-        <w:jc w:val="center"/>
-        <w:rPr>
-          <w:sz w:val="28"/>
-          <w:szCs w:val="28"/>
-        </w:rPr>
-      </w:pPr>
-      <w:r>
-        <w:rPr>
-          <w:sz w:val="28"/>
-          <w:szCs w:val="28"/>
-        </w:rPr>
-        <w:t xml:space="preserve">ЗАДАНИЕ </w:t>
-      </w:r>
-      <w:r>
-        <w:rPr>
-          <w:sz w:val="28"/>
-          <w:szCs w:val="28"/>
-        </w:rPr>
-        <w:t>5</w:t>
-      </w:r>
-      <w:r>
-        <w:rPr>
-          <w:sz w:val="28"/>
-          <w:szCs w:val="28"/>
-        </w:rPr>
-        <w:t xml:space="preserve"> (вариант 14).</w:t>
+        <w:t xml:space="preserve">Для одной из вершин построенной каркасной пирамиды построить </w:t>
+      </w:r>
+      <w:r>
+        <w:rPr>
+          <w:sz w:val="28"/>
+          <w:szCs w:val="28"/>
+        </w:rPr>
+        <w:lastRenderedPageBreak/>
+        <w:t>отрезок прямой, проходящей через данную вершину и параллельный одному из рёбер пирамиды.</w:t>
+      </w:r>
+    </w:p>
+    <w:p>
+      <w:pPr>
+        <w:spacing w:line="360" w:lineRule="auto"/>
+        <w:jc w:val="center"/>
+        <w:rPr>
+          <w:sz w:val="28"/>
+          <w:szCs w:val="28"/>
+        </w:rPr>
+      </w:pPr>
+      <w:r>
+        <w:rPr>
+          <w:sz w:val="28"/>
+          <w:szCs w:val="28"/>
+        </w:rPr>
+        <w:t>ВЫПОЛНЕНИЕ РАБОТЫ:</w:t>
       </w:r>
     </w:p>
     <w:p>
@@ -1781,24 +2327,137 @@
           <w:sz w:val="28"/>
           <w:szCs w:val="28"/>
         </w:rPr>
-        <w:t>Для одной из граней построенной каркасной пирамиды построить плоскость, которой эта грань принадлежит, составить уравнение этой плоскости.</w:t>
-      </w:r>
-    </w:p>
-    <w:p>
-      <w:pPr>
-        <w:spacing w:line="360" w:lineRule="auto"/>
-        <w:jc w:val="center"/>
-        <w:rPr>
-          <w:sz w:val="28"/>
-          <w:szCs w:val="28"/>
-        </w:rPr>
-      </w:pPr>
-      <w:r>
-        <w:rPr>
-          <w:sz w:val="28"/>
-          <w:szCs w:val="28"/>
-        </w:rPr>
-        <w:t>ВЫПОЛНЕНИЕ РАБОТЫ:</w:t>
+        <w:t>Для выполнения данного задания было выполнено несколько примеров, которые продемонстрированы в методическом указании.</w:t>
+      </w:r>
+    </w:p>
+    <w:p>
+      <w:pPr>
+        <w:spacing w:line="360" w:lineRule="auto"/>
+        <w:jc w:val="center"/>
+        <w:rPr>
+          <w:sz w:val="28"/>
+          <w:szCs w:val="28"/>
+        </w:rPr>
+      </w:pPr>
+      <w:r>
+        <w:rPr>
+          <w:sz w:val="28"/>
+          <w:szCs w:val="28"/>
+        </w:rPr>
+        <w:drawing>
+          <wp:inline distT="0" distB="0" distL="0" distR="0" wp14:anchorId="4C97F6A2" wp14:editId="07784063">
+            <wp:extent cx="3433166" cy="5470526"/>
+            <wp:effectExtent l="0" t="0" r="0" b="0"/>
+            <wp:docPr id="8" name="Рисунок 8"/>
+            <wp:cNvGraphicFramePr>
+              <a:graphicFrameLocks xmlns:a="http://schemas.openxmlformats.org/drawingml/2006/main" noChangeAspect="1"/>
+            </wp:cNvGraphicFramePr>
+            <a:graphic xmlns:a="http://schemas.openxmlformats.org/drawingml/2006/main">
+              <a:graphicData uri="http://schemas.openxmlformats.org/drawingml/2006/picture">
+                <pic:pic xmlns:pic="http://schemas.openxmlformats.org/drawingml/2006/picture">
+                  <pic:nvPicPr>
+                    <pic:cNvPr id="1" name=""/>
+                    <pic:cNvPicPr/>
+                  </pic:nvPicPr>
+                  <pic:blipFill>
+                    <a:blip r:embed="rId13"/>
+                    <a:stretch>
+                      <a:fillRect/>
+                    </a:stretch>
+                  </pic:blipFill>
+                  <pic:spPr>
+                    <a:xfrm>
+                      <a:off x="0" y="0"/>
+                      <a:ext cx="3435157" cy="5473699"/>
+                    </a:xfrm>
+                    <a:prstGeom prst="rect">
+                      <a:avLst/>
+                    </a:prstGeom>
+                  </pic:spPr>
+                </pic:pic>
+              </a:graphicData>
+            </a:graphic>
+          </wp:inline>
+        </w:drawing>
+      </w:r>
+    </w:p>
+    <w:p>
+      <w:pPr>
+        <w:spacing w:line="360" w:lineRule="auto"/>
+        <w:jc w:val="center"/>
+        <w:rPr>
+          <w:sz w:val="28"/>
+          <w:szCs w:val="28"/>
+        </w:rPr>
+      </w:pPr>
+      <w:r>
+        <w:rPr>
+          <w:sz w:val="28"/>
+          <w:szCs w:val="28"/>
+        </w:rPr>
+        <w:t xml:space="preserve">Рисунок </w:t>
+      </w:r>
+      <w:r>
+        <w:rPr>
+          <w:sz w:val="28"/>
+          <w:szCs w:val="28"/>
+        </w:rPr>
+        <w:t>8</w:t>
+      </w:r>
+      <w:r>
+        <w:rPr>
+          <w:sz w:val="28"/>
+          <w:szCs w:val="28"/>
+        </w:rPr>
+        <w:t xml:space="preserve">. Выполнение задания </w:t>
+      </w:r>
+      <w:r>
+        <w:rPr>
+          <w:sz w:val="28"/>
+          <w:szCs w:val="28"/>
+        </w:rPr>
+        <w:t>4.</w:t>
+      </w:r>
+    </w:p>
+    <w:p>
+      <w:pPr>
+        <w:spacing w:line="360" w:lineRule="auto"/>
+        <w:jc w:val="center"/>
+        <w:rPr>
+          <w:sz w:val="28"/>
+          <w:szCs w:val="28"/>
+        </w:rPr>
+      </w:pPr>
+    </w:p>
+    <w:p>
+      <w:pPr>
+        <w:spacing w:line="360" w:lineRule="auto"/>
+        <w:jc w:val="center"/>
+        <w:rPr>
+          <w:sz w:val="28"/>
+          <w:szCs w:val="28"/>
+        </w:rPr>
+      </w:pPr>
+      <w:r>
+        <w:rPr>
+          <w:sz w:val="28"/>
+          <w:szCs w:val="28"/>
+        </w:rPr>
+        <w:t xml:space="preserve">ЗАДАНИЕ </w:t>
+      </w:r>
+      <w:r>
+        <w:rPr>
+          <w:sz w:val="28"/>
+          <w:szCs w:val="28"/>
+        </w:rPr>
+        <w:t>5</w:t>
+      </w:r>
+      <w:r>
+        <w:rPr>
+          <w:sz w:val="28"/>
+          <w:szCs w:val="28"/>
+        </w:rPr>
+        <w:t xml:space="preserve"> (вариант 14).</w:t>
       </w:r>
     </w:p>
     <w:p>
@@ -1816,49 +2475,24 @@
           <w:sz w:val="28"/>
           <w:szCs w:val="28"/>
         </w:rPr>
-        <w:t>Для выполнения данного задания было выполнено несколько примеров, которые продемонстрированы в методическом указании.</w:t>
-      </w:r>
-    </w:p>
-    <w:p>
-      <w:pPr>
-        <w:spacing w:line="360" w:lineRule="auto"/>
-        <w:jc w:val="center"/>
-        <w:rPr>
-          <w:sz w:val="28"/>
-          <w:szCs w:val="28"/>
-          <w:lang w:val="en-US"/>
-        </w:rPr>
-      </w:pPr>
-    </w:p>
-    <w:p>
-      <w:pPr>
-        <w:spacing w:line="360" w:lineRule="auto"/>
-        <w:jc w:val="center"/>
-        <w:rPr>
-          <w:sz w:val="28"/>
-          <w:szCs w:val="28"/>
-        </w:rPr>
-      </w:pPr>
-      <w:r>
-        <w:rPr>
-          <w:sz w:val="28"/>
-          <w:szCs w:val="28"/>
-        </w:rPr>
-        <w:t xml:space="preserve">ЗАДАНИЕ </w:t>
-      </w:r>
-      <w:r>
-        <w:rPr>
-          <w:sz w:val="28"/>
-          <w:szCs w:val="28"/>
-        </w:rPr>
-        <w:t>6</w:t>
-      </w:r>
-      <w:r>
-        <w:rPr>
-          <w:sz w:val="28"/>
-          <w:szCs w:val="28"/>
-        </w:rPr>
-        <w:t xml:space="preserve"> (вариант 14).</w:t>
+        <w:t>Для одной из граней построенной каркасной пирамиды построить плоскость, которой эта грань принадлежит, составить уравнение этой плоскости.</w:t>
+      </w:r>
+    </w:p>
+    <w:p>
+      <w:pPr>
+        <w:spacing w:line="360" w:lineRule="auto"/>
+        <w:jc w:val="center"/>
+        <w:rPr>
+          <w:sz w:val="28"/>
+          <w:szCs w:val="28"/>
+        </w:rPr>
+      </w:pPr>
+      <w:r>
+        <w:rPr>
+          <w:sz w:val="28"/>
+          <w:szCs w:val="28"/>
+        </w:rPr>
+        <w:t>ВЫПОЛНЕНИЕ РАБОТЫ:</w:t>
       </w:r>
     </w:p>
     <w:p>
@@ -1876,24 +2510,152 @@
           <w:sz w:val="28"/>
           <w:szCs w:val="28"/>
         </w:rPr>
-        <w:t>Построить плоскость, проходящую через одну из вершин пирамиды, для которой примыкающее к этой точке ребро является нормалью.</w:t>
-      </w:r>
-    </w:p>
-    <w:p>
-      <w:pPr>
-        <w:spacing w:line="360" w:lineRule="auto"/>
-        <w:jc w:val="center"/>
-        <w:rPr>
-          <w:sz w:val="28"/>
-          <w:szCs w:val="28"/>
-        </w:rPr>
-      </w:pPr>
-      <w:r>
-        <w:rPr>
-          <w:sz w:val="28"/>
-          <w:szCs w:val="28"/>
-        </w:rPr>
-        <w:t>ВЫПОЛНЕНИЕ РАБОТЫ:</w:t>
+        <w:lastRenderedPageBreak/>
+        <w:t>Для выполнения данного задания было выполнено несколько примеров, которые продемонстрированы в методическом указании.</w:t>
+      </w:r>
+    </w:p>
+    <w:p>
+      <w:pPr>
+        <w:spacing w:line="360" w:lineRule="auto"/>
+        <w:jc w:val="center"/>
+        <w:rPr>
+          <w:sz w:val="28"/>
+          <w:szCs w:val="28"/>
+        </w:rPr>
+      </w:pPr>
+      <w:r>
+        <w:rPr>
+          <w:sz w:val="28"/>
+          <w:szCs w:val="28"/>
+        </w:rPr>
+        <w:drawing>
+          <wp:inline distT="0" distB="0" distL="0" distR="0" wp14:anchorId="0D21D29C" wp14:editId="51749A3B">
+            <wp:extent cx="3324641" cy="5556250"/>
+            <wp:effectExtent l="0" t="0" r="0" b="0"/>
+            <wp:docPr id="9" name="Рисунок 9"/>
+            <wp:cNvGraphicFramePr>
+              <a:graphicFrameLocks xmlns:a="http://schemas.openxmlformats.org/drawingml/2006/main" noChangeAspect="1"/>
+            </wp:cNvGraphicFramePr>
+            <a:graphic xmlns:a="http://schemas.openxmlformats.org/drawingml/2006/main">
+              <a:graphicData uri="http://schemas.openxmlformats.org/drawingml/2006/picture">
+                <pic:pic xmlns:pic="http://schemas.openxmlformats.org/drawingml/2006/picture">
+                  <pic:nvPicPr>
+                    <pic:cNvPr id="1" name=""/>
+                    <pic:cNvPicPr/>
+                  </pic:nvPicPr>
+                  <pic:blipFill rotWithShape="1">
+                    <a:blip r:embed="rId14"/>
+                    <a:srcRect l="2206" t="4207" b="960"/>
+                    <a:stretch/>
+                  </pic:blipFill>
+                  <pic:spPr bwMode="auto">
+                    <a:xfrm>
+                      <a:off x="0" y="0"/>
+                      <a:ext cx="3332648" cy="5569632"/>
+                    </a:xfrm>
+                    <a:prstGeom prst="rect">
+                      <a:avLst/>
+                    </a:prstGeom>
+                    <a:ln>
+                      <a:noFill/>
+                    </a:ln>
+                    <a:extLst>
+                      <a:ext uri="{53640926-AAD7-44D8-BBD7-CCE9431645EC}">
+                        <a14:shadowObscured xmlns:a14="http://schemas.microsoft.com/office/drawing/2010/main"/>
+                      </a:ext>
+                    </a:extLst>
+                  </pic:spPr>
+                </pic:pic>
+              </a:graphicData>
+            </a:graphic>
+          </wp:inline>
+        </w:drawing>
+      </w:r>
+    </w:p>
+    <w:p>
+      <w:pPr>
+        <w:spacing w:line="360" w:lineRule="auto"/>
+        <w:jc w:val="center"/>
+        <w:rPr>
+          <w:sz w:val="28"/>
+          <w:szCs w:val="28"/>
+        </w:rPr>
+      </w:pPr>
+      <w:r>
+        <w:rPr>
+          <w:sz w:val="28"/>
+          <w:szCs w:val="28"/>
+        </w:rPr>
+        <w:t xml:space="preserve">Рисунок </w:t>
+      </w:r>
+      <w:r>
+        <w:rPr>
+          <w:sz w:val="28"/>
+          <w:szCs w:val="28"/>
+        </w:rPr>
+        <w:t>9</w:t>
+      </w:r>
+      <w:r>
+        <w:rPr>
+          <w:sz w:val="28"/>
+          <w:szCs w:val="28"/>
+        </w:rPr>
+        <w:t xml:space="preserve">. Выполнение задания </w:t>
+      </w:r>
+      <w:r>
+        <w:rPr>
+          <w:sz w:val="28"/>
+          <w:szCs w:val="28"/>
+        </w:rPr>
+        <w:t>5</w:t>
+      </w:r>
+      <w:r>
+        <w:rPr>
+          <w:sz w:val="28"/>
+          <w:szCs w:val="28"/>
+        </w:rPr>
+        <w:t>.</w:t>
+      </w:r>
+    </w:p>
+    <w:p>
+      <w:pPr>
+        <w:spacing w:line="360" w:lineRule="auto"/>
+        <w:jc w:val="center"/>
+        <w:rPr>
+          <w:sz w:val="28"/>
+          <w:szCs w:val="28"/>
+        </w:rPr>
+      </w:pPr>
+    </w:p>
+    <w:p>
+      <w:pPr>
+        <w:spacing w:line="360" w:lineRule="auto"/>
+        <w:jc w:val="center"/>
+        <w:rPr>
+          <w:sz w:val="28"/>
+          <w:szCs w:val="28"/>
+        </w:rPr>
+      </w:pPr>
+      <w:r>
+        <w:rPr>
+          <w:sz w:val="28"/>
+          <w:szCs w:val="28"/>
+        </w:rPr>
+        <w:t xml:space="preserve">ЗАДАНИЕ </w:t>
+      </w:r>
+      <w:r>
+        <w:rPr>
+          <w:sz w:val="28"/>
+          <w:szCs w:val="28"/>
+        </w:rPr>
+        <w:t>6</w:t>
+      </w:r>
+      <w:r>
+        <w:rPr>
+          <w:sz w:val="28"/>
+          <w:szCs w:val="28"/>
+        </w:rPr>
+        <w:t xml:space="preserve"> (вариант 14).</w:t>
       </w:r>
     </w:p>
     <w:p>
@@ -1911,49 +2673,24 @@
           <w:sz w:val="28"/>
           <w:szCs w:val="28"/>
         </w:rPr>
-        <w:t>Для выполнения данного задания было выполнено несколько примеров, которые продемонстрированы в методическом указании.</w:t>
-      </w:r>
-    </w:p>
-    <w:p>
-      <w:pPr>
-        <w:spacing w:line="360" w:lineRule="auto"/>
-        <w:jc w:val="center"/>
-        <w:rPr>
-          <w:sz w:val="28"/>
-          <w:szCs w:val="28"/>
-          <w:lang w:val="en-US"/>
-        </w:rPr>
-      </w:pPr>
-    </w:p>
-    <w:p>
-      <w:pPr>
-        <w:spacing w:line="360" w:lineRule="auto"/>
-        <w:jc w:val="center"/>
-        <w:rPr>
-          <w:sz w:val="28"/>
-          <w:szCs w:val="28"/>
-        </w:rPr>
-      </w:pPr>
-      <w:r>
-        <w:rPr>
-          <w:sz w:val="28"/>
-          <w:szCs w:val="28"/>
-        </w:rPr>
-        <w:t xml:space="preserve">ЗАДАНИЕ </w:t>
-      </w:r>
-      <w:r>
-        <w:rPr>
-          <w:sz w:val="28"/>
-          <w:szCs w:val="28"/>
-        </w:rPr>
-        <w:t>7</w:t>
-      </w:r>
-      <w:r>
-        <w:rPr>
-          <w:sz w:val="28"/>
-          <w:szCs w:val="28"/>
-        </w:rPr>
-        <w:t xml:space="preserve"> (вариант 14).</w:t>
+        <w:t>Построить плоскость, проходящую через одну из вершин пирамиды, для которой примыкающее к этой точке ребро является нормалью.</w:t>
+      </w:r>
+    </w:p>
+    <w:p>
+      <w:pPr>
+        <w:spacing w:line="360" w:lineRule="auto"/>
+        <w:jc w:val="center"/>
+        <w:rPr>
+          <w:sz w:val="28"/>
+          <w:szCs w:val="28"/>
+        </w:rPr>
+      </w:pPr>
+      <w:r>
+        <w:rPr>
+          <w:sz w:val="28"/>
+          <w:szCs w:val="28"/>
+        </w:rPr>
+        <w:t>ВЫПОЛНЕНИЕ РАБОТЫ:</w:t>
       </w:r>
     </w:p>
     <w:p>
@@ -1971,24 +2708,153 @@
           <w:sz w:val="28"/>
           <w:szCs w:val="28"/>
         </w:rPr>
-        <w:t xml:space="preserve">Построить плоскость по двум смежным ребрам пирамиды как направляющим векторам. </w:t>
-      </w:r>
-    </w:p>
-    <w:p>
-      <w:pPr>
-        <w:spacing w:line="360" w:lineRule="auto"/>
-        <w:jc w:val="center"/>
-        <w:rPr>
-          <w:sz w:val="28"/>
-          <w:szCs w:val="28"/>
-        </w:rPr>
-      </w:pPr>
-      <w:r>
-        <w:rPr>
-          <w:sz w:val="28"/>
-          <w:szCs w:val="28"/>
-        </w:rPr>
-        <w:t>ВЫПОЛНЕНИЕ РАБОТЫ:</w:t>
+        <w:t>Для выполнения данного задания было выполнено несколько примеров, которые продемонстрированы в методическом указании.</w:t>
+      </w:r>
+    </w:p>
+    <w:p>
+      <w:pPr>
+        <w:spacing w:line="360" w:lineRule="auto"/>
+        <w:jc w:val="center"/>
+        <w:rPr>
+          <w:sz w:val="28"/>
+          <w:szCs w:val="28"/>
+          <w:lang w:val="en-US"/>
+        </w:rPr>
+      </w:pPr>
+      <w:r>
+        <w:rPr>
+          <w:noProof/>
+          <w:sz w:val="28"/>
+          <w:szCs w:val="28"/>
+          <w:lang w:val="en-US"/>
+        </w:rPr>
+        <w:lastRenderedPageBreak/>
+        <w:drawing>
+          <wp:inline distT="0" distB="0" distL="0" distR="0" wp14:anchorId="7A625A60" wp14:editId="75C8C83B">
+            <wp:extent cx="5937250" cy="5226050"/>
+            <wp:effectExtent l="0" t="0" r="0" b="0"/>
+            <wp:docPr id="10" name="Рисунок 10"/>
+            <wp:cNvGraphicFramePr>
+              <a:graphicFrameLocks xmlns:a="http://schemas.openxmlformats.org/drawingml/2006/main" noChangeAspect="1"/>
+            </wp:cNvGraphicFramePr>
+            <a:graphic xmlns:a="http://schemas.openxmlformats.org/drawingml/2006/main">
+              <a:graphicData uri="http://schemas.openxmlformats.org/drawingml/2006/picture">
+                <pic:pic xmlns:pic="http://schemas.openxmlformats.org/drawingml/2006/picture">
+                  <pic:nvPicPr>
+                    <pic:cNvPr id="0" name="Picture 2"/>
+                    <pic:cNvPicPr>
+                      <a:picLocks noChangeAspect="1" noChangeArrowheads="1"/>
+                    </pic:cNvPicPr>
+                  </pic:nvPicPr>
+                  <pic:blipFill rotWithShape="1">
+                    <a:blip r:embed="rId15">
+                      <a:extLst>
+                        <a:ext uri="{28A0092B-C50C-407E-A947-70E740481C1C}">
+                          <a14:useLocalDpi xmlns:a14="http://schemas.microsoft.com/office/drawing/2010/main" val="0"/>
+                        </a:ext>
+                      </a:extLst>
+                    </a:blip>
+                    <a:srcRect t="4746"/>
+                    <a:stretch/>
+                  </pic:blipFill>
+                  <pic:spPr bwMode="auto">
+                    <a:xfrm>
+                      <a:off x="0" y="0"/>
+                      <a:ext cx="5937250" cy="5226050"/>
+                    </a:xfrm>
+                    <a:prstGeom prst="rect">
+                      <a:avLst/>
+                    </a:prstGeom>
+                    <a:noFill/>
+                    <a:ln>
+                      <a:noFill/>
+                    </a:ln>
+                    <a:extLst>
+                      <a:ext uri="{53640926-AAD7-44D8-BBD7-CCE9431645EC}">
+                        <a14:shadowObscured xmlns:a14="http://schemas.microsoft.com/office/drawing/2010/main"/>
+                      </a:ext>
+                    </a:extLst>
+                  </pic:spPr>
+                </pic:pic>
+              </a:graphicData>
+            </a:graphic>
+          </wp:inline>
+        </w:drawing>
+      </w:r>
+    </w:p>
+    <w:p>
+      <w:pPr>
+        <w:spacing w:line="360" w:lineRule="auto"/>
+        <w:jc w:val="center"/>
+        <w:rPr>
+          <w:sz w:val="28"/>
+          <w:szCs w:val="28"/>
+        </w:rPr>
+      </w:pPr>
+      <w:r>
+        <w:rPr>
+          <w:sz w:val="28"/>
+          <w:szCs w:val="28"/>
+        </w:rPr>
+        <w:t xml:space="preserve">Рисунок </w:t>
+      </w:r>
+      <w:r>
+        <w:rPr>
+          <w:sz w:val="28"/>
+          <w:szCs w:val="28"/>
+          <w:lang w:val="en-US"/>
+        </w:rPr>
+        <w:t>10</w:t>
+      </w:r>
+      <w:r>
+        <w:rPr>
+          <w:sz w:val="28"/>
+          <w:szCs w:val="28"/>
+        </w:rPr>
+        <w:t xml:space="preserve">. Выполнение задания </w:t>
+      </w:r>
+      <w:r>
+        <w:rPr>
+          <w:sz w:val="28"/>
+          <w:szCs w:val="28"/>
+          <w:lang w:val="en-US"/>
+        </w:rPr>
+        <w:t>6</w:t>
+      </w:r>
+      <w:r>
+        <w:rPr>
+          <w:sz w:val="28"/>
+          <w:szCs w:val="28"/>
+        </w:rPr>
+        <w:t>.</w:t>
+      </w:r>
+    </w:p>
+    <w:p>
+      <w:pPr>
+        <w:spacing w:line="360" w:lineRule="auto"/>
+        <w:jc w:val="center"/>
+        <w:rPr>
+          <w:sz w:val="28"/>
+          <w:szCs w:val="28"/>
+          <w:lang w:val="en-US"/>
+        </w:rPr>
+      </w:pPr>
+    </w:p>
+    <w:p>
+      <w:pPr>
+        <w:spacing w:line="360" w:lineRule="auto"/>
+        <w:jc w:val="center"/>
+        <w:rPr>
+          <w:sz w:val="28"/>
+          <w:szCs w:val="28"/>
+        </w:rPr>
+      </w:pPr>
+      <w:r>
+        <w:rPr>
+          <w:sz w:val="28"/>
+          <w:szCs w:val="28"/>
+        </w:rPr>
+        <w:t>ЗАДАНИЕ 7 (вариант 14).</w:t>
       </w:r>
     </w:p>
     <w:p>
@@ -2006,49 +2872,24 @@
           <w:sz w:val="28"/>
           <w:szCs w:val="28"/>
         </w:rPr>
-        <w:t>Для выполнения данного задания было выполнено несколько примеров, которые продемонстрированы в методическом указании.</w:t>
-      </w:r>
-    </w:p>
-    <w:p>
-      <w:pPr>
-        <w:spacing w:line="360" w:lineRule="auto"/>
-        <w:jc w:val="center"/>
-        <w:rPr>
-          <w:sz w:val="28"/>
-          <w:szCs w:val="28"/>
-        </w:rPr>
-      </w:pPr>
-    </w:p>
-    <w:p>
-      <w:pPr>
-        <w:spacing w:line="360" w:lineRule="auto"/>
-        <w:jc w:val="center"/>
-        <w:rPr>
-          <w:sz w:val="28"/>
-          <w:szCs w:val="28"/>
-        </w:rPr>
-      </w:pPr>
-      <w:r>
-        <w:rPr>
-          <w:sz w:val="28"/>
-          <w:szCs w:val="28"/>
-        </w:rPr>
-        <w:lastRenderedPageBreak/>
-        <w:t xml:space="preserve">ЗАДАНИЕ </w:t>
-      </w:r>
-      <w:r>
-        <w:rPr>
-          <w:sz w:val="28"/>
-          <w:szCs w:val="28"/>
-        </w:rPr>
-        <w:t>8</w:t>
-      </w:r>
-      <w:r>
-        <w:rPr>
-          <w:sz w:val="28"/>
-          <w:szCs w:val="28"/>
-        </w:rPr>
-        <w:t xml:space="preserve"> (вариант 14).</w:t>
+        <w:t xml:space="preserve">Построить плоскость по двум смежным ребрам пирамиды как направляющим векторам. </w:t>
+      </w:r>
+    </w:p>
+    <w:p>
+      <w:pPr>
+        <w:spacing w:line="360" w:lineRule="auto"/>
+        <w:jc w:val="center"/>
+        <w:rPr>
+          <w:sz w:val="28"/>
+          <w:szCs w:val="28"/>
+        </w:rPr>
+      </w:pPr>
+      <w:r>
+        <w:rPr>
+          <w:sz w:val="28"/>
+          <w:szCs w:val="28"/>
+        </w:rPr>
+        <w:t>ВЫПОЛНЕНИЕ РАБОТЫ:</w:t>
       </w:r>
     </w:p>
     <w:p>
@@ -2066,57 +2907,84 @@
           <w:sz w:val="28"/>
           <w:szCs w:val="28"/>
         </w:rPr>
-        <w:t>Построить плоскость по коэффициентам канонического уравнения</w:t>
-      </w:r>
-      <w:r>
-        <w:rPr>
-          <w:sz w:val="28"/>
-          <w:szCs w:val="28"/>
-        </w:rPr>
-        <w:t xml:space="preserve"> </w:t>
-      </w:r>
-      <w:r>
+        <w:t>Для выполнения данного задания было выполнено несколько примеров, которые продемонстрированы в методическом указании.</w:t>
+      </w:r>
+    </w:p>
+    <w:p>
+      <w:pPr>
+        <w:spacing w:line="360" w:lineRule="auto"/>
+        <w:jc w:val="center"/>
         <w:rPr>
           <w:sz w:val="28"/>
           <w:szCs w:val="28"/>
           <w:lang w:val="en-US"/>
         </w:rPr>
-        <w:t>A</w:t>
-      </w:r>
-      <w:r>
-        <w:rPr>
-          <w:sz w:val="28"/>
-          <w:szCs w:val="28"/>
-        </w:rPr>
-        <w:t xml:space="preserve"> </w:t>
-      </w:r>
-      <w:r>
-        <w:rPr>
-          <w:sz w:val="28"/>
-          <w:szCs w:val="28"/>
-        </w:rPr>
-        <w:t>–</w:t>
-      </w:r>
-      <w:r>
-        <w:rPr>
-          <w:sz w:val="28"/>
-          <w:szCs w:val="28"/>
-        </w:rPr>
-        <w:t xml:space="preserve"> </w:t>
-      </w:r>
-      <w:r>
-        <w:rPr>
-          <w:sz w:val="28"/>
-          <w:szCs w:val="28"/>
-        </w:rPr>
-        <w:t>6</w:t>
-      </w:r>
-      <w:r>
-        <w:rPr>
-          <w:sz w:val="28"/>
-          <w:szCs w:val="28"/>
-        </w:rPr>
-        <w:t xml:space="preserve">, </w:t>
+      </w:pPr>
+      <w:r>
+        <w:rPr>
+          <w:sz w:val="28"/>
+          <w:szCs w:val="28"/>
+        </w:rPr>
+        <w:lastRenderedPageBreak/>
+        <w:drawing>
+          <wp:inline distT="0" distB="0" distL="0" distR="0" wp14:anchorId="1601E3D3" wp14:editId="49B0D76A">
+            <wp:extent cx="3975100" cy="6100135"/>
+            <wp:effectExtent l="0" t="0" r="0" b="0"/>
+            <wp:docPr id="11" name="Рисунок 11"/>
+            <wp:cNvGraphicFramePr>
+              <a:graphicFrameLocks xmlns:a="http://schemas.openxmlformats.org/drawingml/2006/main" noChangeAspect="1"/>
+            </wp:cNvGraphicFramePr>
+            <a:graphic xmlns:a="http://schemas.openxmlformats.org/drawingml/2006/main">
+              <a:graphicData uri="http://schemas.openxmlformats.org/drawingml/2006/picture">
+                <pic:pic xmlns:pic="http://schemas.openxmlformats.org/drawingml/2006/picture">
+                  <pic:nvPicPr>
+                    <pic:cNvPr id="1" name=""/>
+                    <pic:cNvPicPr/>
+                  </pic:nvPicPr>
+                  <pic:blipFill rotWithShape="1">
+                    <a:blip r:embed="rId16"/>
+                    <a:srcRect l="-1" t="681" r="1700"/>
+                    <a:stretch/>
+                  </pic:blipFill>
+                  <pic:spPr bwMode="auto">
+                    <a:xfrm>
+                      <a:off x="0" y="0"/>
+                      <a:ext cx="3976604" cy="6102443"/>
+                    </a:xfrm>
+                    <a:prstGeom prst="rect">
+                      <a:avLst/>
+                    </a:prstGeom>
+                    <a:ln>
+                      <a:noFill/>
+                    </a:ln>
+                    <a:extLst>
+                      <a:ext uri="{53640926-AAD7-44D8-BBD7-CCE9431645EC}">
+                        <a14:shadowObscured xmlns:a14="http://schemas.microsoft.com/office/drawing/2010/main"/>
+                      </a:ext>
+                    </a:extLst>
+                  </pic:spPr>
+                </pic:pic>
+              </a:graphicData>
+            </a:graphic>
+          </wp:inline>
+        </w:drawing>
+      </w:r>
+    </w:p>
+    <w:p>
+      <w:pPr>
+        <w:spacing w:line="360" w:lineRule="auto"/>
+        <w:jc w:val="center"/>
+        <w:rPr>
+          <w:sz w:val="28"/>
+          <w:szCs w:val="28"/>
+        </w:rPr>
+      </w:pPr>
+      <w:r>
+        <w:rPr>
+          <w:sz w:val="28"/>
+          <w:szCs w:val="28"/>
+        </w:rPr>
+        <w:t xml:space="preserve">Рисунок </w:t>
       </w:r>
       <w:r>
         <w:rPr>
@@ -2124,28 +2992,7 @@
           <w:szCs w:val="28"/>
           <w:lang w:val="en-US"/>
         </w:rPr>
-        <w:t>B</w:t>
-      </w:r>
-      <w:r>
-        <w:rPr>
-          <w:sz w:val="28"/>
-          <w:szCs w:val="28"/>
-        </w:rPr>
-        <w:t xml:space="preserve"> –</w:t>
-      </w:r>
-      <w:r>
-        <w:rPr>
-          <w:sz w:val="28"/>
-          <w:szCs w:val="28"/>
-        </w:rPr>
-        <w:t xml:space="preserve"> 3</w:t>
-      </w:r>
-      <w:r>
-        <w:rPr>
-          <w:sz w:val="28"/>
-          <w:szCs w:val="28"/>
-        </w:rPr>
-        <w:t xml:space="preserve">, </w:t>
+        <w:t>1</w:t>
       </w:r>
       <w:r>
         <w:rPr>
@@ -2153,28 +3000,14 @@
           <w:szCs w:val="28"/>
           <w:lang w:val="en-US"/>
         </w:rPr>
-        <w:t>C</w:t>
-      </w:r>
-      <w:r>
-        <w:rPr>
-          <w:sz w:val="28"/>
-          <w:szCs w:val="28"/>
-        </w:rPr>
-        <w:t xml:space="preserve"> –</w:t>
-      </w:r>
-      <w:r>
-        <w:rPr>
-          <w:sz w:val="28"/>
-          <w:szCs w:val="28"/>
-        </w:rPr>
-        <w:t xml:space="preserve"> 7</w:t>
-      </w:r>
-      <w:r>
-        <w:rPr>
-          <w:sz w:val="28"/>
-          <w:szCs w:val="28"/>
-        </w:rPr>
-        <w:t xml:space="preserve">, </w:t>
+        <w:t>1</w:t>
+      </w:r>
+      <w:r>
+        <w:rPr>
+          <w:sz w:val="28"/>
+          <w:szCs w:val="28"/>
+        </w:rPr>
+        <w:t xml:space="preserve">. Выполнение задания </w:t>
       </w:r>
       <w:r>
         <w:rPr>
@@ -2182,21 +3015,7 @@
           <w:szCs w:val="28"/>
           <w:lang w:val="en-US"/>
         </w:rPr>
-        <w:t>D</w:t>
-      </w:r>
-      <w:r>
-        <w:rPr>
-          <w:sz w:val="28"/>
-          <w:szCs w:val="28"/>
-        </w:rPr>
-        <w:t xml:space="preserve"> –</w:t>
-      </w:r>
-      <w:r>
-        <w:rPr>
-          <w:sz w:val="28"/>
-          <w:szCs w:val="28"/>
-        </w:rPr>
-        <w:t xml:space="preserve"> 11</w:t>
+        <w:t>7</w:t>
       </w:r>
       <w:r>
         <w:rPr>
@@ -2213,14 +3032,25 @@
         <w:rPr>
           <w:sz w:val="28"/>
           <w:szCs w:val="28"/>
-        </w:rPr>
-      </w:pPr>
-      <w:r>
-        <w:rPr>
-          <w:sz w:val="28"/>
-          <w:szCs w:val="28"/>
-        </w:rPr>
-        <w:t>ВЫПОЛНЕНИЕ РАБОТЫ:</w:t>
+          <w:lang w:val="en-US"/>
+        </w:rPr>
+      </w:pPr>
+    </w:p>
+    <w:p>
+      <w:pPr>
+        <w:spacing w:line="360" w:lineRule="auto"/>
+        <w:jc w:val="center"/>
+        <w:rPr>
+          <w:sz w:val="28"/>
+          <w:szCs w:val="28"/>
+        </w:rPr>
+      </w:pPr>
+      <w:r>
+        <w:rPr>
+          <w:sz w:val="28"/>
+          <w:szCs w:val="28"/>
+        </w:rPr>
+        <w:t>ЗАДАНИЕ 8 (вариант 14).</w:t>
       </w:r>
     </w:p>
     <w:p>
@@ -2231,15 +3061,119 @@
         <w:rPr>
           <w:sz w:val="28"/>
           <w:szCs w:val="28"/>
+        </w:rPr>
+      </w:pPr>
+      <w:r>
+        <w:rPr>
+          <w:sz w:val="28"/>
+          <w:szCs w:val="28"/>
+        </w:rPr>
+        <w:t>Построить плоскость по коэффициентам канонического уравнения</w:t>
+      </w:r>
+      <w:r>
+        <w:rPr>
+          <w:sz w:val="28"/>
+          <w:szCs w:val="28"/>
+        </w:rPr>
+        <w:t xml:space="preserve"> </w:t>
+      </w:r>
+      <w:r>
+        <w:rPr>
+          <w:sz w:val="28"/>
+          <w:szCs w:val="28"/>
           <w:lang w:val="en-US"/>
         </w:rPr>
-      </w:pPr>
-      <w:r>
-        <w:rPr>
-          <w:sz w:val="28"/>
-          <w:szCs w:val="28"/>
-        </w:rPr>
-        <w:t>Для выполнения данного задания было выполнено несколько примеров, которые продемонстрированы в методическом указании.</w:t>
+        <w:t>A</w:t>
+      </w:r>
+      <w:r>
+        <w:rPr>
+          <w:sz w:val="28"/>
+          <w:szCs w:val="28"/>
+        </w:rPr>
+        <w:t xml:space="preserve"> </w:t>
+      </w:r>
+      <w:r>
+        <w:rPr>
+          <w:sz w:val="28"/>
+          <w:szCs w:val="28"/>
+        </w:rPr>
+        <w:t>–</w:t>
+      </w:r>
+      <w:r>
+        <w:rPr>
+          <w:sz w:val="28"/>
+          <w:szCs w:val="28"/>
+        </w:rPr>
+        <w:t xml:space="preserve"> 6, </w:t>
+      </w:r>
+      <w:r>
+        <w:rPr>
+          <w:sz w:val="28"/>
+          <w:szCs w:val="28"/>
+          <w:lang w:val="en-US"/>
+        </w:rPr>
+        <w:t>B</w:t>
+      </w:r>
+      <w:r>
+        <w:rPr>
+          <w:sz w:val="28"/>
+          <w:szCs w:val="28"/>
+        </w:rPr>
+        <w:t xml:space="preserve"> – 3, </w:t>
+      </w:r>
+      <w:r>
+        <w:rPr>
+          <w:sz w:val="28"/>
+          <w:szCs w:val="28"/>
+          <w:lang w:val="en-US"/>
+        </w:rPr>
+        <w:t>C</w:t>
+      </w:r>
+      <w:r>
+        <w:rPr>
+          <w:sz w:val="28"/>
+          <w:szCs w:val="28"/>
+        </w:rPr>
+        <w:t xml:space="preserve"> – 7, </w:t>
+      </w:r>
+      <w:r>
+        <w:rPr>
+          <w:sz w:val="28"/>
+          <w:szCs w:val="28"/>
+          <w:lang w:val="en-US"/>
+        </w:rPr>
+        <w:t>D</w:t>
+      </w:r>
+      <w:r>
+        <w:rPr>
+          <w:sz w:val="28"/>
+          <w:szCs w:val="28"/>
+        </w:rPr>
+        <w:t xml:space="preserve"> – 11</w:t>
+      </w:r>
+      <w:r>
+        <w:rPr>
+          <w:sz w:val="28"/>
+          <w:szCs w:val="28"/>
+        </w:rPr>
+        <w:t>.</w:t>
+      </w:r>
+    </w:p>
+    <w:p>
+      <w:pPr>
+        <w:spacing w:line="360" w:lineRule="auto"/>
+        <w:jc w:val="center"/>
+        <w:rPr>
+          <w:sz w:val="28"/>
+          <w:szCs w:val="28"/>
+        </w:rPr>
+      </w:pPr>
+      <w:r>
+        <w:rPr>
+          <w:sz w:val="28"/>
+          <w:szCs w:val="28"/>
+        </w:rPr>
+        <w:t>ВЫПОЛНЕНИЕ РАБОТЫ:</w:t>
       </w:r>
     </w:p>
     <w:p>
@@ -2250,6 +3184,131 @@
         <w:rPr>
           <w:sz w:val="28"/>
           <w:szCs w:val="28"/>
+        </w:rPr>
+      </w:pPr>
+      <w:r>
+        <w:rPr>
+          <w:sz w:val="28"/>
+          <w:szCs w:val="28"/>
+        </w:rPr>
+        <w:t>Для выполнения данного задания было выполнено несколько примеров, которые продемонстрированы в методическом указании.</w:t>
+      </w:r>
+    </w:p>
+    <w:p>
+      <w:pPr>
+        <w:spacing w:line="360" w:lineRule="auto"/>
+        <w:jc w:val="center"/>
+        <w:rPr>
+          <w:sz w:val="28"/>
+          <w:szCs w:val="28"/>
+          <w:lang w:val="en-US"/>
+        </w:rPr>
+      </w:pPr>
+      <w:r>
+        <w:rPr>
+          <w:sz w:val="28"/>
+          <w:szCs w:val="28"/>
+        </w:rPr>
+        <w:lastRenderedPageBreak/>
+        <w:drawing>
+          <wp:inline distT="0" distB="0" distL="0" distR="0" wp14:anchorId="086C8C2C" wp14:editId="67F4C03F">
+            <wp:extent cx="3862170" cy="5229860"/>
+            <wp:effectExtent l="0" t="0" r="0" b="0"/>
+            <wp:docPr id="12" name="Рисунок 12"/>
+            <wp:cNvGraphicFramePr>
+              <a:graphicFrameLocks xmlns:a="http://schemas.openxmlformats.org/drawingml/2006/main" noChangeAspect="1"/>
+            </wp:cNvGraphicFramePr>
+            <a:graphic xmlns:a="http://schemas.openxmlformats.org/drawingml/2006/main">
+              <a:graphicData uri="http://schemas.openxmlformats.org/drawingml/2006/picture">
+                <pic:pic xmlns:pic="http://schemas.openxmlformats.org/drawingml/2006/picture">
+                  <pic:nvPicPr>
+                    <pic:cNvPr id="1" name=""/>
+                    <pic:cNvPicPr/>
+                  </pic:nvPicPr>
+                  <pic:blipFill>
+                    <a:blip r:embed="rId17"/>
+                    <a:stretch>
+                      <a:fillRect/>
+                    </a:stretch>
+                  </pic:blipFill>
+                  <pic:spPr>
+                    <a:xfrm>
+                      <a:off x="0" y="0"/>
+                      <a:ext cx="3867874" cy="5237584"/>
+                    </a:xfrm>
+                    <a:prstGeom prst="rect">
+                      <a:avLst/>
+                    </a:prstGeom>
+                  </pic:spPr>
+                </pic:pic>
+              </a:graphicData>
+            </a:graphic>
+          </wp:inline>
+        </w:drawing>
+      </w:r>
+    </w:p>
+    <w:p>
+      <w:pPr>
+        <w:spacing w:line="360" w:lineRule="auto"/>
+        <w:jc w:val="center"/>
+        <w:rPr>
+          <w:sz w:val="28"/>
+          <w:szCs w:val="28"/>
+        </w:rPr>
+      </w:pPr>
+      <w:r>
+        <w:rPr>
+          <w:sz w:val="28"/>
+          <w:szCs w:val="28"/>
+        </w:rPr>
+        <w:t xml:space="preserve">Рисунок </w:t>
+      </w:r>
+      <w:r>
+        <w:rPr>
+          <w:sz w:val="28"/>
+          <w:szCs w:val="28"/>
+          <w:lang w:val="en-US"/>
+        </w:rPr>
+        <w:t>1</w:t>
+      </w:r>
+      <w:r>
+        <w:rPr>
+          <w:sz w:val="28"/>
+          <w:szCs w:val="28"/>
+          <w:lang w:val="en-US"/>
+        </w:rPr>
+        <w:t>2</w:t>
+      </w:r>
+      <w:r>
+        <w:rPr>
+          <w:sz w:val="28"/>
+          <w:szCs w:val="28"/>
+        </w:rPr>
+        <w:t xml:space="preserve">. Выполнение задания </w:t>
+      </w:r>
+      <w:r>
+        <w:rPr>
+          <w:sz w:val="28"/>
+          <w:szCs w:val="28"/>
+          <w:lang w:val="en-US"/>
+        </w:rPr>
+        <w:t>8</w:t>
+      </w:r>
+      <w:r>
+        <w:rPr>
+          <w:sz w:val="28"/>
+          <w:szCs w:val="28"/>
+        </w:rPr>
+        <w:t>.</w:t>
+      </w:r>
+    </w:p>
+    <w:p>
+      <w:pPr>
+        <w:spacing w:line="360" w:lineRule="auto"/>
+        <w:jc w:val="center"/>
+        <w:rPr>
+          <w:sz w:val="28"/>
+          <w:szCs w:val="28"/>
           <w:lang w:val="en-US"/>
         </w:rPr>
       </w:pPr>
@@ -2331,21 +3390,7 @@
           <w:sz w:val="28"/>
           <w:szCs w:val="28"/>
         </w:rPr>
-        <w:t xml:space="preserve"> </w:t>
-      </w:r>
-      <w:r>
-        <w:rPr>
-          <w:sz w:val="28"/>
-          <w:szCs w:val="28"/>
-        </w:rPr>
-        <w:t>8</w:t>
-      </w:r>
-      <w:r>
-        <w:rPr>
-          <w:sz w:val="28"/>
-          <w:szCs w:val="28"/>
-        </w:rPr>
-        <w:t xml:space="preserve">, </w:t>
+        <w:t xml:space="preserve"> 8, </w:t>
       </w:r>
       <w:proofErr w:type="spellStart"/>
       <w:r>
@@ -2362,21 +3407,7 @@
           <w:sz w:val="28"/>
           <w:szCs w:val="28"/>
         </w:rPr>
-        <w:t xml:space="preserve"> –</w:t>
-      </w:r>
-      <w:r>
-        <w:rPr>
-          <w:sz w:val="28"/>
-          <w:szCs w:val="28"/>
-        </w:rPr>
-        <w:t xml:space="preserve"> 1</w:t>
-      </w:r>
-      <w:r>
-        <w:rPr>
-          <w:sz w:val="28"/>
-          <w:szCs w:val="28"/>
-        </w:rPr>
-        <w:t xml:space="preserve">, </w:t>
+        <w:t xml:space="preserve"> – 1, </w:t>
       </w:r>
       <w:proofErr w:type="spellStart"/>
       <w:r>
@@ -2393,21 +3424,7 @@
           <w:sz w:val="28"/>
           <w:szCs w:val="28"/>
         </w:rPr>
-        <w:t xml:space="preserve"> –</w:t>
-      </w:r>
-      <w:r>
-        <w:rPr>
-          <w:sz w:val="28"/>
-          <w:szCs w:val="28"/>
-        </w:rPr>
-        <w:t xml:space="preserve"> 7</w:t>
-      </w:r>
-      <w:r>
-        <w:rPr>
-          <w:sz w:val="28"/>
-          <w:szCs w:val="28"/>
-        </w:rPr>
-        <w:t>.</w:t>
+        <w:t xml:space="preserve"> – 7.</w:t>
       </w:r>
     </w:p>
     <w:p>
@@ -2454,6 +3471,111 @@
           <w:szCs w:val="28"/>
         </w:rPr>
       </w:pPr>
+      <w:r>
+        <w:rPr>
+          <w:sz w:val="28"/>
+          <w:szCs w:val="28"/>
+        </w:rPr>
+        <w:lastRenderedPageBreak/>
+        <w:drawing>
+          <wp:inline distT="0" distB="0" distL="0" distR="0" wp14:anchorId="2CCED1E6" wp14:editId="746F6A38">
+            <wp:extent cx="3154547" cy="5772150"/>
+            <wp:effectExtent l="0" t="0" r="0" b="0"/>
+            <wp:docPr id="13" name="Рисунок 13"/>
+            <wp:cNvGraphicFramePr>
+              <a:graphicFrameLocks xmlns:a="http://schemas.openxmlformats.org/drawingml/2006/main" noChangeAspect="1"/>
+            </wp:cNvGraphicFramePr>
+            <a:graphic xmlns:a="http://schemas.openxmlformats.org/drawingml/2006/main">
+              <a:graphicData uri="http://schemas.openxmlformats.org/drawingml/2006/picture">
+                <pic:pic xmlns:pic="http://schemas.openxmlformats.org/drawingml/2006/picture">
+                  <pic:nvPicPr>
+                    <pic:cNvPr id="1" name=""/>
+                    <pic:cNvPicPr/>
+                  </pic:nvPicPr>
+                  <pic:blipFill>
+                    <a:blip r:embed="rId18"/>
+                    <a:stretch>
+                      <a:fillRect/>
+                    </a:stretch>
+                  </pic:blipFill>
+                  <pic:spPr>
+                    <a:xfrm>
+                      <a:off x="0" y="0"/>
+                      <a:ext cx="3159317" cy="5780878"/>
+                    </a:xfrm>
+                    <a:prstGeom prst="rect">
+                      <a:avLst/>
+                    </a:prstGeom>
+                  </pic:spPr>
+                </pic:pic>
+              </a:graphicData>
+            </a:graphic>
+          </wp:inline>
+        </w:drawing>
+      </w:r>
+    </w:p>
+    <w:p>
+      <w:pPr>
+        <w:spacing w:line="360" w:lineRule="auto"/>
+        <w:jc w:val="center"/>
+        <w:rPr>
+          <w:sz w:val="28"/>
+          <w:szCs w:val="28"/>
+        </w:rPr>
+      </w:pPr>
+      <w:r>
+        <w:rPr>
+          <w:sz w:val="28"/>
+          <w:szCs w:val="28"/>
+        </w:rPr>
+        <w:t xml:space="preserve">Рисунок </w:t>
+      </w:r>
+      <w:r>
+        <w:rPr>
+          <w:sz w:val="28"/>
+          <w:szCs w:val="28"/>
+          <w:lang w:val="en-US"/>
+        </w:rPr>
+        <w:t>1</w:t>
+      </w:r>
+      <w:r>
+        <w:rPr>
+          <w:sz w:val="28"/>
+          <w:szCs w:val="28"/>
+        </w:rPr>
+        <w:t>3</w:t>
+      </w:r>
+      <w:r>
+        <w:rPr>
+          <w:sz w:val="28"/>
+          <w:szCs w:val="28"/>
+        </w:rPr>
+        <w:t xml:space="preserve">. Выполнение задания </w:t>
+      </w:r>
+      <w:r>
+        <w:rPr>
+          <w:sz w:val="28"/>
+          <w:szCs w:val="28"/>
+        </w:rPr>
+        <w:t>9</w:t>
+      </w:r>
+      <w:r>
+        <w:rPr>
+          <w:sz w:val="28"/>
+          <w:szCs w:val="28"/>
+        </w:rPr>
+        <w:t>.</w:t>
+      </w:r>
+    </w:p>
+    <w:p>
+      <w:pPr>
+        <w:spacing w:line="360" w:lineRule="auto"/>
+        <w:jc w:val="center"/>
+        <w:rPr>
+          <w:sz w:val="28"/>
+          <w:szCs w:val="28"/>
+        </w:rPr>
+      </w:pPr>
     </w:p>
     <w:p>
       <w:pPr>
@@ -2484,13 +3606,7 @@
         <w:rPr>
           <w:sz w:val="28"/>
         </w:rPr>
-        <w:t>в пространстве</w:t>
-      </w:r>
-      <w:r>
-        <w:rPr>
-          <w:sz w:val="28"/>
-        </w:rPr>
-        <w:t xml:space="preserve"> </w:t>
+        <w:t xml:space="preserve">в пространстве </w:t>
       </w:r>
       <w:r>
         <w:rPr>
@@ -2514,9 +3630,9 @@
       </w:r>
     </w:p>
     <w:sectPr>
-      <w:footerReference w:type="even" r:id="rId6"/>
-      <w:footerReference w:type="default" r:id="rId7"/>
-      <w:footerReference w:type="first" r:id="rId8"/>
+      <w:footerReference w:type="even" r:id="rId19"/>
+      <w:footerReference w:type="default" r:id="rId20"/>
+      <w:footerReference w:type="first" r:id="rId21"/>
       <w:pgSz w:w="11906" w:h="16838"/>
       <w:pgMar w:top="1134" w:right="850" w:bottom="1134" w:left="1701" w:header="0" w:footer="708" w:gutter="0"/>
       <w:cols w:space="720"/>
@@ -3026,7 +4142,7 @@
   <w:style w:type="paragraph" w:default="1" w:styleId="a">
     <w:name w:val="Normal"/>
     <w:qFormat/>
-    <w:rsid w:val="007C211B"/>
+    <w:rsid w:val="00B46876"/>
     <w:pPr>
       <w:widowControl w:val="0"/>
     </w:pPr>
@@ -3061,6 +4177,7 @@
   <w:style w:type="character" w:default="1" w:styleId="a0">
     <w:name w:val="Default Paragraph Font"/>
     <w:uiPriority w:val="1"/>
+    <w:semiHidden/>
     <w:unhideWhenUsed/>
   </w:style>
   <w:style w:type="table" w:default="1" w:styleId="a1">

</xml_diff>

<commit_message>
Done lab 3 i guess
</commit_message>
<xml_diff>
--- a/mathcad/Лабораторная-работа-3/ПРИ123-ММГО-#03-Нямаа.docx
+++ b/mathcad/Лабораторная-работа-3/ПРИ123-ММГО-#03-Нямаа.docx
@@ -335,25 +335,7 @@
           <w:sz w:val="24"/>
           <w:szCs w:val="24"/>
         </w:rPr>
-        <w:t>(</w:t>
-      </w:r>
-      <w:proofErr w:type="spellStart"/>
-      <w:r>
-        <w:rPr>
-          <w:b/>
-          <w:sz w:val="24"/>
-          <w:szCs w:val="24"/>
-        </w:rPr>
-        <w:t>ВлГУ</w:t>
-      </w:r>
-      <w:proofErr w:type="spellEnd"/>
-      <w:r>
-        <w:rPr>
-          <w:b/>
-          <w:sz w:val="24"/>
-          <w:szCs w:val="24"/>
-        </w:rPr>
-        <w:t>)</w:t>
+        <w:t>(ВлГУ)</w:t>
       </w:r>
     </w:p>
     <w:p>
@@ -712,18 +694,8 @@
           <w:sz w:val="28"/>
           <w:szCs w:val="28"/>
         </w:rPr>
-        <w:t xml:space="preserve">А.Ц. </w:t>
-      </w:r>
-      <w:proofErr w:type="spellStart"/>
-      <w:r>
-        <w:rPr>
-          <w:color w:val="000000" w:themeColor="text1"/>
-          <w:sz w:val="28"/>
-          <w:szCs w:val="28"/>
-        </w:rPr>
-        <w:t>Нямаа</w:t>
-      </w:r>
-      <w:proofErr w:type="spellEnd"/>
+        <w:t>А.Ц. Нямаа</w:t>
+      </w:r>
     </w:p>
     <w:p>
       <w:pPr>
@@ -865,21 +837,7 @@
         <w:rPr>
           <w:sz w:val="28"/>
         </w:rPr>
-        <w:t xml:space="preserve">в среде </w:t>
-      </w:r>
-      <w:proofErr w:type="spellStart"/>
-      <w:r>
-        <w:rPr>
-          <w:sz w:val="28"/>
-        </w:rPr>
-        <w:t>MathCAD</w:t>
-      </w:r>
-      <w:proofErr w:type="spellEnd"/>
-      <w:r>
-        <w:rPr>
-          <w:sz w:val="28"/>
-        </w:rPr>
-        <w:t>.</w:t>
+        <w:t>в среде MathCAD.</w:t>
       </w:r>
     </w:p>
     <w:p>
@@ -1028,7 +986,14 @@
           <w:sz w:val="28"/>
           <w:szCs w:val="28"/>
         </w:rPr>
-        <w:t xml:space="preserve"> В ходе выполнения данного примера была построена прямая по двум точкам, также была найдена длина данного отрезка.</w:t>
+        <w:t xml:space="preserve"> В ходе выполнения данного примера была построена прямая</w:t>
+      </w:r>
+      <w:r>
+        <w:rPr>
+          <w:sz w:val="28"/>
+          <w:szCs w:val="28"/>
+        </w:rPr>
+        <w:t>, заданная двумя точками, в пространстве.</w:t>
       </w:r>
     </w:p>
     <w:p>
@@ -1046,6 +1011,7 @@
       <w:r>
         <w:rPr>
           <w:rFonts w:ascii="Times New Roman" w:hAnsi="Times New Roman"/>
+          <w:noProof/>
           <w:sz w:val="28"/>
           <w:szCs w:val="28"/>
           <w:lang w:val="ru-RU"/>
@@ -1131,12 +1097,20 @@
         <w:ind w:firstLine="709"/>
         <w:jc w:val="both"/>
         <w:rPr>
+          <w:sz w:val="28"/>
+          <w:szCs w:val="28"/>
+        </w:rPr>
+      </w:pPr>
+      <w:r>
+        <w:rPr>
           <w:b/>
           <w:bCs/>
           <w:sz w:val="28"/>
           <w:szCs w:val="28"/>
         </w:rPr>
-      </w:pPr>
+        <w:lastRenderedPageBreak/>
+        <w:t xml:space="preserve">Пример </w:t>
+      </w:r>
       <w:r>
         <w:rPr>
           <w:b/>
@@ -1144,8 +1118,7 @@
           <w:sz w:val="28"/>
           <w:szCs w:val="28"/>
         </w:rPr>
-        <w:lastRenderedPageBreak/>
-        <w:t xml:space="preserve">Пример </w:t>
+        <w:t>3</w:t>
       </w:r>
       <w:r>
         <w:rPr>
@@ -1154,7 +1127,7 @@
           <w:sz w:val="28"/>
           <w:szCs w:val="28"/>
         </w:rPr>
-        <w:t>3</w:t>
+        <w:t>.</w:t>
       </w:r>
       <w:r>
         <w:rPr>
@@ -1163,7 +1136,7 @@
           <w:sz w:val="28"/>
           <w:szCs w:val="28"/>
         </w:rPr>
-        <w:t>.</w:t>
+        <w:t>2</w:t>
       </w:r>
       <w:r>
         <w:rPr>
@@ -1172,7 +1145,7 @@
           <w:sz w:val="28"/>
           <w:szCs w:val="28"/>
         </w:rPr>
-        <w:t>2</w:t>
+        <w:t>.</w:t>
       </w:r>
       <w:r>
         <w:rPr>
@@ -1181,29 +1154,116 @@
           <w:sz w:val="28"/>
           <w:szCs w:val="28"/>
         </w:rPr>
-        <w:t>.</w:t>
-      </w:r>
-      <w:r>
-        <w:rPr>
-          <w:b/>
-          <w:bCs/>
-          <w:sz w:val="28"/>
-          <w:szCs w:val="28"/>
-        </w:rPr>
         <w:t xml:space="preserve"> </w:t>
       </w:r>
-    </w:p>
-    <w:p>
-      <w:pPr>
-        <w:spacing w:line="360" w:lineRule="auto"/>
-        <w:jc w:val="center"/>
-        <w:rPr>
-          <w:sz w:val="28"/>
-          <w:szCs w:val="28"/>
-        </w:rPr>
-      </w:pPr>
-      <w:r>
-        <w:rPr>
+      <w:r>
+        <w:rPr>
+          <w:sz w:val="28"/>
+          <w:szCs w:val="28"/>
+        </w:rPr>
+        <w:t xml:space="preserve">Для выполнения данного примера были построены две прямые, заданные точками </w:t>
+      </w:r>
+      <w:r>
+        <w:rPr>
+          <w:sz w:val="28"/>
+          <w:szCs w:val="28"/>
+        </w:rPr>
+        <w:t>(</w:t>
+      </w:r>
+      <w:r>
+        <w:rPr>
+          <w:sz w:val="28"/>
+          <w:szCs w:val="28"/>
+          <w:lang w:val="en-US"/>
+        </w:rPr>
+        <w:t>A</w:t>
+      </w:r>
+      <w:r>
+        <w:rPr>
+          <w:sz w:val="28"/>
+          <w:szCs w:val="28"/>
+        </w:rPr>
+        <w:t>1,</w:t>
+      </w:r>
+      <w:r>
+        <w:rPr>
+          <w:sz w:val="28"/>
+          <w:szCs w:val="28"/>
+          <w:lang w:val="en-US"/>
+        </w:rPr>
+        <w:t>B</w:t>
+      </w:r>
+      <w:r>
+        <w:rPr>
+          <w:sz w:val="28"/>
+          <w:szCs w:val="28"/>
+        </w:rPr>
+        <w:t xml:space="preserve">1) </w:t>
+      </w:r>
+      <w:r>
+        <w:rPr>
+          <w:sz w:val="28"/>
+          <w:szCs w:val="28"/>
+        </w:rPr>
+        <w:t xml:space="preserve">и </w:t>
+      </w:r>
+      <w:r>
+        <w:rPr>
+          <w:sz w:val="28"/>
+          <w:szCs w:val="28"/>
+        </w:rPr>
+        <w:t>(</w:t>
+      </w:r>
+      <w:r>
+        <w:rPr>
+          <w:sz w:val="28"/>
+          <w:szCs w:val="28"/>
+          <w:lang w:val="en-US"/>
+        </w:rPr>
+        <w:t>A</w:t>
+      </w:r>
+      <w:r>
+        <w:rPr>
+          <w:sz w:val="28"/>
+          <w:szCs w:val="28"/>
+        </w:rPr>
+        <w:t>2,</w:t>
+      </w:r>
+      <w:r>
+        <w:rPr>
+          <w:sz w:val="28"/>
+          <w:szCs w:val="28"/>
+          <w:lang w:val="en-US"/>
+        </w:rPr>
+        <w:t>B</w:t>
+      </w:r>
+      <w:r>
+        <w:rPr>
+          <w:sz w:val="28"/>
+          <w:szCs w:val="28"/>
+        </w:rPr>
+        <w:t>2</w:t>
+      </w:r>
+      <w:r>
+        <w:rPr>
+          <w:sz w:val="28"/>
+          <w:szCs w:val="28"/>
+        </w:rPr>
+        <w:t>), и был построен взаимный перпендикуляр для этих двух прямых.</w:t>
+      </w:r>
+    </w:p>
+    <w:p>
+      <w:pPr>
+        <w:spacing w:line="360" w:lineRule="auto"/>
+        <w:jc w:val="center"/>
+        <w:rPr>
+          <w:sz w:val="28"/>
+          <w:szCs w:val="28"/>
+        </w:rPr>
+      </w:pPr>
+      <w:r>
+        <w:rPr>
+          <w:noProof/>
           <w:sz w:val="28"/>
           <w:szCs w:val="28"/>
         </w:rPr>
@@ -1265,56 +1325,7 @@
           <w:sz w:val="28"/>
           <w:szCs w:val="28"/>
         </w:rPr>
-        <w:t xml:space="preserve">Рисунок </w:t>
-      </w:r>
-      <w:r>
-        <w:rPr>
-          <w:sz w:val="28"/>
-          <w:szCs w:val="28"/>
-        </w:rPr>
-        <w:t>2</w:t>
-      </w:r>
-      <w:r>
-        <w:rPr>
-          <w:sz w:val="28"/>
-          <w:szCs w:val="28"/>
-        </w:rPr>
-        <w:t xml:space="preserve">. Выполнение пример </w:t>
-      </w:r>
-      <w:r>
-        <w:rPr>
-          <w:sz w:val="28"/>
-          <w:szCs w:val="28"/>
-        </w:rPr>
-        <w:t>3</w:t>
-      </w:r>
-      <w:r>
-        <w:rPr>
-          <w:sz w:val="28"/>
-          <w:szCs w:val="28"/>
-        </w:rPr>
-        <w:t>.</w:t>
-      </w:r>
-      <w:r>
-        <w:rPr>
-          <w:sz w:val="28"/>
-          <w:szCs w:val="28"/>
-        </w:rPr>
-        <w:t>2</w:t>
-      </w:r>
-      <w:r>
-        <w:rPr>
-          <w:sz w:val="28"/>
-          <w:szCs w:val="28"/>
-        </w:rPr>
-        <w:t>.</w:t>
-      </w:r>
-      <w:r>
-        <w:rPr>
-          <w:sz w:val="28"/>
-          <w:szCs w:val="28"/>
-        </w:rPr>
-        <w:t xml:space="preserve"> Часть 1.</w:t>
+        <w:t>Рисунок 2. Выполнение пример 3.2. Часть 1.</w:t>
       </w:r>
     </w:p>
     <w:p>
@@ -1325,32 +1336,25 @@
           <w:szCs w:val="28"/>
         </w:rPr>
       </w:pPr>
-      <w:r>
-        <w:rPr>
-          <w:sz w:val="28"/>
-          <w:szCs w:val="28"/>
-        </w:rPr>
-        <w:br w:type="page"/>
-      </w:r>
-    </w:p>
-    <w:p>
-      <w:pPr>
-        <w:spacing w:line="360" w:lineRule="auto"/>
-        <w:jc w:val="center"/>
-        <w:rPr>
-          <w:sz w:val="28"/>
-          <w:szCs w:val="28"/>
-        </w:rPr>
-      </w:pPr>
-      <w:r>
-        <w:rPr>
-          <w:sz w:val="28"/>
-          <w:szCs w:val="28"/>
-        </w:rPr>
-        <w:lastRenderedPageBreak/>
+    </w:p>
+    <w:p>
+      <w:pPr>
+        <w:spacing w:line="360" w:lineRule="auto"/>
+        <w:jc w:val="center"/>
+        <w:rPr>
+          <w:sz w:val="28"/>
+          <w:szCs w:val="28"/>
+        </w:rPr>
+      </w:pPr>
+      <w:r>
+        <w:rPr>
+          <w:noProof/>
+          <w:sz w:val="28"/>
+          <w:szCs w:val="28"/>
+        </w:rPr>
         <w:drawing>
-          <wp:inline distT="0" distB="0" distL="0" distR="0" wp14:anchorId="08BCFC38" wp14:editId="13F8D171">
-            <wp:extent cx="3119896" cy="2762250"/>
+          <wp:inline distT="0" distB="0" distL="0" distR="0" wp14:anchorId="08BCFC38" wp14:editId="17513777">
+            <wp:extent cx="3111500" cy="2754817"/>
             <wp:effectExtent l="0" t="0" r="0" b="0"/>
             <wp:docPr id="3" name="Рисунок 3"/>
             <wp:cNvGraphicFramePr>
@@ -1372,7 +1376,7 @@
                   <pic:spPr>
                     <a:xfrm>
                       <a:off x="0" y="0"/>
-                      <a:ext cx="3128579" cy="2769938"/>
+                      <a:ext cx="3137668" cy="2777986"/>
                     </a:xfrm>
                     <a:prstGeom prst="rect">
                       <a:avLst/>
@@ -1399,49 +1403,7 @@
           <w:sz w:val="28"/>
           <w:szCs w:val="28"/>
         </w:rPr>
-        <w:t xml:space="preserve">Рисунок </w:t>
-      </w:r>
-      <w:r>
-        <w:rPr>
-          <w:sz w:val="28"/>
-          <w:szCs w:val="28"/>
-        </w:rPr>
-        <w:t>3</w:t>
-      </w:r>
-      <w:r>
-        <w:rPr>
-          <w:sz w:val="28"/>
-          <w:szCs w:val="28"/>
-        </w:rPr>
-        <w:t>. Выполнение пример 3.</w:t>
-      </w:r>
-      <w:r>
-        <w:rPr>
-          <w:sz w:val="28"/>
-          <w:szCs w:val="28"/>
-        </w:rPr>
-        <w:t>2</w:t>
-      </w:r>
-      <w:r>
-        <w:rPr>
-          <w:sz w:val="28"/>
-          <w:szCs w:val="28"/>
-        </w:rPr>
-        <w:t xml:space="preserve">. Часть </w:t>
-      </w:r>
-      <w:r>
-        <w:rPr>
-          <w:sz w:val="28"/>
-          <w:szCs w:val="28"/>
-        </w:rPr>
-        <w:t>2</w:t>
-      </w:r>
-      <w:r>
-        <w:rPr>
-          <w:sz w:val="28"/>
-          <w:szCs w:val="28"/>
-        </w:rPr>
-        <w:t>.</w:t>
+        <w:t>Рисунок 3. Выполнение пример 3.2. Часть 2.</w:t>
       </w:r>
     </w:p>
     <w:p>
@@ -1450,12 +1412,20 @@
         <w:ind w:firstLine="709"/>
         <w:jc w:val="both"/>
         <w:rPr>
+          <w:sz w:val="28"/>
+          <w:szCs w:val="28"/>
+        </w:rPr>
+      </w:pPr>
+      <w:r>
+        <w:rPr>
           <w:b/>
           <w:bCs/>
           <w:sz w:val="28"/>
           <w:szCs w:val="28"/>
         </w:rPr>
-      </w:pPr>
+        <w:lastRenderedPageBreak/>
+        <w:t xml:space="preserve">Пример </w:t>
+      </w:r>
       <w:r>
         <w:rPr>
           <w:b/>
@@ -1463,7 +1433,7 @@
           <w:sz w:val="28"/>
           <w:szCs w:val="28"/>
         </w:rPr>
-        <w:t xml:space="preserve">Пример </w:t>
+        <w:t>3</w:t>
       </w:r>
       <w:r>
         <w:rPr>
@@ -1472,7 +1442,7 @@
           <w:sz w:val="28"/>
           <w:szCs w:val="28"/>
         </w:rPr>
-        <w:t>3</w:t>
+        <w:t>.</w:t>
       </w:r>
       <w:r>
         <w:rPr>
@@ -1481,7 +1451,7 @@
           <w:sz w:val="28"/>
           <w:szCs w:val="28"/>
         </w:rPr>
-        <w:t>.</w:t>
+        <w:t>3</w:t>
       </w:r>
       <w:r>
         <w:rPr>
@@ -1490,7 +1460,7 @@
           <w:sz w:val="28"/>
           <w:szCs w:val="28"/>
         </w:rPr>
-        <w:t>3</w:t>
+        <w:t>.</w:t>
       </w:r>
       <w:r>
         <w:rPr>
@@ -1499,17 +1469,15 @@
           <w:sz w:val="28"/>
           <w:szCs w:val="28"/>
         </w:rPr>
-        <w:t>.</w:t>
-      </w:r>
-      <w:r>
-        <w:rPr>
-          <w:b/>
-          <w:bCs/>
-          <w:sz w:val="28"/>
-          <w:szCs w:val="28"/>
-        </w:rPr>
         <w:t xml:space="preserve"> </w:t>
       </w:r>
+      <w:r>
+        <w:rPr>
+          <w:sz w:val="28"/>
+          <w:szCs w:val="28"/>
+        </w:rPr>
+        <w:t>В ходе выполнения примера было составлено уравнение плоскости, проходящее через три точки. Для этого был составлен определитель и приравнен к нулю, после чего раскрыт.</w:t>
+      </w:r>
     </w:p>
     <w:p>
       <w:pPr>
@@ -1529,7 +1497,7 @@
           <w:lang w:val="en-US"/>
         </w:rPr>
         <w:drawing>
-          <wp:inline distT="0" distB="0" distL="0" distR="0" wp14:anchorId="7810F91C" wp14:editId="5B964755">
+          <wp:inline distT="0" distB="0" distL="0" distR="0" wp14:anchorId="7810F91C" wp14:editId="2B6280D6">
             <wp:extent cx="5937250" cy="1358900"/>
             <wp:effectExtent l="0" t="0" r="0" b="0"/>
             <wp:docPr id="4" name="Рисунок 4"/>
@@ -1592,21 +1560,7 @@
           <w:sz w:val="28"/>
           <w:szCs w:val="28"/>
         </w:rPr>
-        <w:t xml:space="preserve">Рисунок </w:t>
-      </w:r>
-      <w:r>
-        <w:rPr>
-          <w:sz w:val="28"/>
-          <w:szCs w:val="28"/>
-        </w:rPr>
-        <w:t>4</w:t>
-      </w:r>
-      <w:r>
-        <w:rPr>
-          <w:sz w:val="28"/>
-          <w:szCs w:val="28"/>
-        </w:rPr>
-        <w:t>. Выполнение пример 3.3.</w:t>
+        <w:t>Рисунок 4. Выполнение пример 3.3.</w:t>
       </w:r>
     </w:p>
     <w:p>
@@ -1908,20 +1862,65 @@
           <w:sz w:val="28"/>
           <w:szCs w:val="28"/>
         </w:rPr>
-        <w:t>Для выполнения данного задания было выполнено несколько примеров, которые продемонстрированы в методическом указании.</w:t>
-      </w:r>
-    </w:p>
-    <w:p>
-      <w:pPr>
-        <w:spacing w:line="360" w:lineRule="auto"/>
-        <w:jc w:val="center"/>
-        <w:rPr>
-          <w:sz w:val="28"/>
-          <w:szCs w:val="28"/>
-        </w:rPr>
-      </w:pPr>
-      <w:r>
-        <w:rPr>
+        <w:t xml:space="preserve">Для выполнения данного задания </w:t>
+      </w:r>
+      <w:r>
+        <w:rPr>
+          <w:sz w:val="28"/>
+          <w:szCs w:val="28"/>
+        </w:rPr>
+        <w:t>были проставлены точки в пространстве (</w:t>
+      </w:r>
+      <w:r>
+        <w:rPr>
+          <w:sz w:val="28"/>
+          <w:szCs w:val="28"/>
+          <w:lang w:val="en-US"/>
+        </w:rPr>
+        <w:t>T</w:t>
+      </w:r>
+      <w:r>
+        <w:rPr>
+          <w:sz w:val="28"/>
+          <w:szCs w:val="28"/>
+        </w:rPr>
+        <w:t>1-</w:t>
+      </w:r>
+      <w:r>
+        <w:rPr>
+          <w:sz w:val="28"/>
+          <w:szCs w:val="28"/>
+          <w:lang w:val="en-US"/>
+        </w:rPr>
+        <w:t>T</w:t>
+      </w:r>
+      <w:r>
+        <w:rPr>
+          <w:sz w:val="28"/>
+          <w:szCs w:val="28"/>
+        </w:rPr>
+        <w:t>4)</w:t>
+      </w:r>
+      <w:r>
+        <w:rPr>
+          <w:sz w:val="28"/>
+          <w:szCs w:val="28"/>
+        </w:rPr>
+        <w:t>, а также проведены прямые ко всем точкам, которые являются вершинами фигуры. Таким образом, построил каркасную треугольную пирамиду.</w:t>
+      </w:r>
+    </w:p>
+    <w:p>
+      <w:pPr>
+        <w:spacing w:line="360" w:lineRule="auto"/>
+        <w:jc w:val="center"/>
+        <w:rPr>
+          <w:sz w:val="28"/>
+          <w:szCs w:val="28"/>
+        </w:rPr>
+      </w:pPr>
+      <w:r>
+        <w:rPr>
+          <w:noProof/>
           <w:sz w:val="28"/>
           <w:szCs w:val="28"/>
         </w:rPr>
@@ -2071,20 +2070,63 @@
           <w:sz w:val="28"/>
           <w:szCs w:val="28"/>
         </w:rPr>
-        <w:t>Для выполнения данного задания было выполнено несколько примеров, которые продемонстрированы в методическом указании.</w:t>
-      </w:r>
-    </w:p>
-    <w:p>
-      <w:pPr>
-        <w:spacing w:line="360" w:lineRule="auto"/>
-        <w:jc w:val="center"/>
-        <w:rPr>
-          <w:sz w:val="28"/>
-          <w:szCs w:val="28"/>
-        </w:rPr>
-      </w:pPr>
-      <w:r>
-        <w:rPr>
+        <w:t>В ходе выполнения данного задания были выделены две противоположенные прямые, к которым необходимо построить взаимный перпендикуляр. Для этого сначала были найдены нормали двух прямых и составлены параметрические уравнения прямых.</w:t>
+      </w:r>
+      <w:r>
+        <w:rPr>
+          <w:sz w:val="28"/>
+          <w:szCs w:val="28"/>
+        </w:rPr>
+        <w:t xml:space="preserve"> </w:t>
+      </w:r>
+      <w:r>
+        <w:rPr>
+          <w:sz w:val="28"/>
+          <w:szCs w:val="28"/>
+        </w:rPr>
+        <w:t>Далее была составлена и решена система</w:t>
+      </w:r>
+      <w:r>
+        <w:rPr>
+          <w:sz w:val="28"/>
+          <w:szCs w:val="28"/>
+        </w:rPr>
+        <w:t xml:space="preserve">, находящая коэффициенты, при которых прямые находятся на минимальном расстоянии друг от друга. В конце была найдены точки и проведен </w:t>
+      </w:r>
+      <w:r>
+        <w:rPr>
+          <w:sz w:val="28"/>
+          <w:szCs w:val="28"/>
+        </w:rPr>
+        <w:t>перпендикуляр</w:t>
+      </w:r>
+      <w:r>
+        <w:rPr>
+          <w:sz w:val="28"/>
+          <w:szCs w:val="28"/>
+        </w:rPr>
+        <w:t>.</w:t>
+      </w:r>
+      <w:r>
+        <w:rPr>
+          <w:sz w:val="28"/>
+          <w:szCs w:val="28"/>
+        </w:rPr>
+        <w:t xml:space="preserve"> </w:t>
+      </w:r>
+    </w:p>
+    <w:p>
+      <w:pPr>
+        <w:spacing w:line="360" w:lineRule="auto"/>
+        <w:jc w:val="center"/>
+        <w:rPr>
+          <w:sz w:val="28"/>
+          <w:szCs w:val="28"/>
+        </w:rPr>
+      </w:pPr>
+      <w:r>
+        <w:rPr>
+          <w:noProof/>
           <w:sz w:val="28"/>
           <w:szCs w:val="28"/>
         </w:rPr>
@@ -2164,6 +2206,7 @@
       </w:pPr>
       <w:r>
         <w:rPr>
+          <w:noProof/>
           <w:sz w:val="28"/>
           <w:szCs w:val="28"/>
         </w:rPr>
@@ -2327,20 +2370,95 @@
           <w:sz w:val="28"/>
           <w:szCs w:val="28"/>
         </w:rPr>
-        <w:t>Для выполнения данного задания было выполнено несколько примеров, которые продемонстрированы в методическом указании.</w:t>
-      </w:r>
-    </w:p>
-    <w:p>
-      <w:pPr>
-        <w:spacing w:line="360" w:lineRule="auto"/>
-        <w:jc w:val="center"/>
-        <w:rPr>
-          <w:sz w:val="28"/>
-          <w:szCs w:val="28"/>
-        </w:rPr>
-      </w:pPr>
-      <w:r>
-        <w:rPr>
+        <w:t xml:space="preserve">Для выполнения данного задания была использована точка </w:t>
+      </w:r>
+      <w:r>
+        <w:rPr>
+          <w:sz w:val="28"/>
+          <w:szCs w:val="28"/>
+          <w:lang w:val="en-US"/>
+        </w:rPr>
+        <w:t>T</w:t>
+      </w:r>
+      <w:r>
+        <w:rPr>
+          <w:sz w:val="28"/>
+          <w:szCs w:val="28"/>
+        </w:rPr>
+        <w:t>4</w:t>
+      </w:r>
+      <w:r>
+        <w:rPr>
+          <w:sz w:val="28"/>
+          <w:szCs w:val="28"/>
+        </w:rPr>
+        <w:t xml:space="preserve">, через которую необходимо провести прямой отрезок, и ребро </w:t>
+      </w:r>
+      <w:r>
+        <w:rPr>
+          <w:sz w:val="28"/>
+          <w:szCs w:val="28"/>
+          <w:lang w:val="en-US"/>
+        </w:rPr>
+        <w:t>T</w:t>
+      </w:r>
+      <w:r>
+        <w:rPr>
+          <w:sz w:val="28"/>
+          <w:szCs w:val="28"/>
+        </w:rPr>
+        <w:t>1</w:t>
+      </w:r>
+      <w:r>
+        <w:rPr>
+          <w:sz w:val="28"/>
+          <w:szCs w:val="28"/>
+          <w:lang w:val="en-US"/>
+        </w:rPr>
+        <w:t>T</w:t>
+      </w:r>
+      <w:r>
+        <w:rPr>
+          <w:sz w:val="28"/>
+          <w:szCs w:val="28"/>
+        </w:rPr>
+        <w:t>3</w:t>
+      </w:r>
+      <w:r>
+        <w:rPr>
+          <w:sz w:val="28"/>
+          <w:szCs w:val="28"/>
+        </w:rPr>
+        <w:t xml:space="preserve">, как параллельный отрезок. Был найден вектор ребра и составлено параметрическое представление прямой через вершину </w:t>
+      </w:r>
+      <w:r>
+        <w:rPr>
+          <w:sz w:val="28"/>
+          <w:szCs w:val="28"/>
+          <w:lang w:val="en-US"/>
+        </w:rPr>
+        <w:t>A</w:t>
+      </w:r>
+      <w:r>
+        <w:rPr>
+          <w:sz w:val="28"/>
+          <w:szCs w:val="28"/>
+        </w:rPr>
+        <w:t>.</w:t>
+      </w:r>
+    </w:p>
+    <w:p>
+      <w:pPr>
+        <w:spacing w:line="360" w:lineRule="auto"/>
+        <w:jc w:val="center"/>
+        <w:rPr>
+          <w:sz w:val="28"/>
+          <w:szCs w:val="28"/>
+        </w:rPr>
+      </w:pPr>
+      <w:r>
+        <w:rPr>
+          <w:noProof/>
           <w:sz w:val="28"/>
           <w:szCs w:val="28"/>
         </w:rPr>
@@ -2395,28 +2513,7 @@
           <w:sz w:val="28"/>
           <w:szCs w:val="28"/>
         </w:rPr>
-        <w:t xml:space="preserve">Рисунок </w:t>
-      </w:r>
-      <w:r>
-        <w:rPr>
-          <w:sz w:val="28"/>
-          <w:szCs w:val="28"/>
-        </w:rPr>
-        <w:t>8</w:t>
-      </w:r>
-      <w:r>
-        <w:rPr>
-          <w:sz w:val="28"/>
-          <w:szCs w:val="28"/>
-        </w:rPr>
-        <w:t xml:space="preserve">. Выполнение задания </w:t>
-      </w:r>
-      <w:r>
-        <w:rPr>
-          <w:sz w:val="28"/>
-          <w:szCs w:val="28"/>
-        </w:rPr>
-        <w:t>4.</w:t>
+        <w:t>Рисунок 8. Выполнение задания 4.</w:t>
       </w:r>
     </w:p>
     <w:p>
@@ -2475,7 +2572,15 @@
           <w:sz w:val="28"/>
           <w:szCs w:val="28"/>
         </w:rPr>
-        <w:t>Для одной из граней построенной каркасной пирамиды построить плоскость, которой эта грань принадлежит, составить уравнение этой плоскости.</w:t>
+        <w:t xml:space="preserve">Для одной из граней построенной каркасной пирамиды построить плоскость, которой эта грань принадлежит, составить уравнение этой </w:t>
+      </w:r>
+      <w:r>
+        <w:rPr>
+          <w:sz w:val="28"/>
+          <w:szCs w:val="28"/>
+        </w:rPr>
+        <w:lastRenderedPageBreak/>
+        <w:t>плоскости.</w:t>
       </w:r>
     </w:p>
     <w:p>
@@ -2510,21 +2615,28 @@
           <w:sz w:val="28"/>
           <w:szCs w:val="28"/>
         </w:rPr>
-        <w:lastRenderedPageBreak/>
-        <w:t>Для выполнения данного задания было выполнено несколько примеров, которые продемонстрированы в методическом указании.</w:t>
-      </w:r>
-    </w:p>
-    <w:p>
-      <w:pPr>
-        <w:spacing w:line="360" w:lineRule="auto"/>
-        <w:jc w:val="center"/>
-        <w:rPr>
-          <w:sz w:val="28"/>
-          <w:szCs w:val="28"/>
-        </w:rPr>
-      </w:pPr>
-      <w:r>
-        <w:rPr>
+        <w:t>В ходе выполнения данного задания была построена плоскость</w:t>
+      </w:r>
+      <w:r>
+        <w:rPr>
+          <w:sz w:val="28"/>
+          <w:szCs w:val="28"/>
+        </w:rPr>
+        <w:t xml:space="preserve"> по трем точкам так, чтобы эта грань принадлежала плоскости.</w:t>
+      </w:r>
+    </w:p>
+    <w:p>
+      <w:pPr>
+        <w:spacing w:line="360" w:lineRule="auto"/>
+        <w:jc w:val="center"/>
+        <w:rPr>
+          <w:sz w:val="28"/>
+          <w:szCs w:val="28"/>
+        </w:rPr>
+      </w:pPr>
+      <w:r>
+        <w:rPr>
+          <w:noProof/>
           <w:sz w:val="28"/>
           <w:szCs w:val="28"/>
         </w:rPr>
@@ -2586,35 +2698,7 @@
           <w:sz w:val="28"/>
           <w:szCs w:val="28"/>
         </w:rPr>
-        <w:t xml:space="preserve">Рисунок </w:t>
-      </w:r>
-      <w:r>
-        <w:rPr>
-          <w:sz w:val="28"/>
-          <w:szCs w:val="28"/>
-        </w:rPr>
-        <w:t>9</w:t>
-      </w:r>
-      <w:r>
-        <w:rPr>
-          <w:sz w:val="28"/>
-          <w:szCs w:val="28"/>
-        </w:rPr>
-        <w:t xml:space="preserve">. Выполнение задания </w:t>
-      </w:r>
-      <w:r>
-        <w:rPr>
-          <w:sz w:val="28"/>
-          <w:szCs w:val="28"/>
-        </w:rPr>
-        <w:t>5</w:t>
-      </w:r>
-      <w:r>
-        <w:rPr>
-          <w:sz w:val="28"/>
-          <w:szCs w:val="28"/>
-        </w:rPr>
-        <w:t>.</w:t>
+        <w:t>Рисунок 9. Выполнение задания 5.</w:t>
       </w:r>
     </w:p>
     <w:p>
@@ -2708,7 +2792,22 @@
           <w:sz w:val="28"/>
           <w:szCs w:val="28"/>
         </w:rPr>
-        <w:t>Для выполнения данного задания было выполнено несколько примеров, которые продемонстрированы в методическом указании.</w:t>
+        <w:t xml:space="preserve">Для выполнения данного задания было построено уравнение </w:t>
+      </w:r>
+      <w:r>
+        <w:rPr>
+          <w:sz w:val="28"/>
+          <w:szCs w:val="28"/>
+        </w:rPr>
+        <w:lastRenderedPageBreak/>
+        <w:t>плоскости, заданное нормалью так, чтобы плоскость проходила через вершину пирамиды, а примыкающее к точке ребро стало нормалью.</w:t>
+      </w:r>
+      <w:r>
+        <w:rPr>
+          <w:sz w:val="28"/>
+          <w:szCs w:val="28"/>
+        </w:rPr>
+        <w:t xml:space="preserve"> По данному уравнению была построена плоскость.</w:t>
       </w:r>
     </w:p>
     <w:p>
@@ -2728,7 +2827,6 @@
           <w:szCs w:val="28"/>
           <w:lang w:val="en-US"/>
         </w:rPr>
-        <w:lastRenderedPageBreak/>
         <w:drawing>
           <wp:inline distT="0" distB="0" distL="0" distR="0" wp14:anchorId="7A625A60" wp14:editId="75C8C83B">
             <wp:extent cx="5937250" cy="5226050"/>
@@ -2802,7 +2900,6 @@
         <w:rPr>
           <w:sz w:val="28"/>
           <w:szCs w:val="28"/>
-          <w:lang w:val="en-US"/>
         </w:rPr>
         <w:t>10</w:t>
       </w:r>
@@ -2817,7 +2914,6 @@
         <w:rPr>
           <w:sz w:val="28"/>
           <w:szCs w:val="28"/>
-          <w:lang w:val="en-US"/>
         </w:rPr>
         <w:t>6</w:t>
       </w:r>
@@ -2836,7 +2932,6 @@
         <w:rPr>
           <w:sz w:val="28"/>
           <w:szCs w:val="28"/>
-          <w:lang w:val="en-US"/>
         </w:rPr>
       </w:pPr>
     </w:p>
@@ -2907,7 +3002,14 @@
           <w:sz w:val="28"/>
           <w:szCs w:val="28"/>
         </w:rPr>
-        <w:t>Для выполнения данного задания было выполнено несколько примеров, которые продемонстрированы в методическом указании.</w:t>
+        <w:t>В ходе выполнения данного задания было построено уравнение пло</w:t>
+      </w:r>
+      <w:r>
+        <w:rPr>
+          <w:sz w:val="28"/>
+          <w:szCs w:val="28"/>
+        </w:rPr>
+        <w:t>скости, заданное направляющими векторами, которыми стали два смежных угла. По данному уравнению была построена плоскость.</w:t>
       </w:r>
     </w:p>
     <w:p>
@@ -2922,6 +3024,7 @@
       </w:pPr>
       <w:r>
         <w:rPr>
+          <w:noProof/>
           <w:sz w:val="28"/>
           <w:szCs w:val="28"/>
         </w:rPr>
@@ -2990,17 +3093,8 @@
         <w:rPr>
           <w:sz w:val="28"/>
           <w:szCs w:val="28"/>
-          <w:lang w:val="en-US"/>
-        </w:rPr>
-        <w:t>1</w:t>
-      </w:r>
-      <w:r>
-        <w:rPr>
-          <w:sz w:val="28"/>
-          <w:szCs w:val="28"/>
-          <w:lang w:val="en-US"/>
-        </w:rPr>
-        <w:t>1</w:t>
+        </w:rPr>
+        <w:t>11</w:t>
       </w:r>
       <w:r>
         <w:rPr>
@@ -3013,7 +3107,6 @@
         <w:rPr>
           <w:sz w:val="28"/>
           <w:szCs w:val="28"/>
-          <w:lang w:val="en-US"/>
         </w:rPr>
         <w:t>7</w:t>
       </w:r>
@@ -3032,7 +3125,6 @@
         <w:rPr>
           <w:sz w:val="28"/>
           <w:szCs w:val="28"/>
-          <w:lang w:val="en-US"/>
         </w:rPr>
       </w:pPr>
     </w:p>
@@ -3191,7 +3283,21 @@
           <w:sz w:val="28"/>
           <w:szCs w:val="28"/>
         </w:rPr>
-        <w:t>Для выполнения данного задания было выполнено несколько примеров, которые продемонстрированы в методическом указании.</w:t>
+        <w:t>В ходе выполнения данного задания была построена плоскость, заданная каноническим уравнением, коэффициент</w:t>
+      </w:r>
+      <w:r>
+        <w:rPr>
+          <w:sz w:val="28"/>
+          <w:szCs w:val="28"/>
+        </w:rPr>
+        <w:t>ы</w:t>
+      </w:r>
+      <w:r>
+        <w:rPr>
+          <w:sz w:val="28"/>
+          <w:szCs w:val="28"/>
+        </w:rPr>
+        <w:t xml:space="preserve"> которой даны в условии задачи.</w:t>
       </w:r>
     </w:p>
     <w:p>
@@ -3206,6 +3312,7 @@
       </w:pPr>
       <w:r>
         <w:rPr>
+          <w:noProof/>
           <w:sz w:val="28"/>
           <w:szCs w:val="28"/>
         </w:rPr>
@@ -3267,17 +3374,8 @@
         <w:rPr>
           <w:sz w:val="28"/>
           <w:szCs w:val="28"/>
-          <w:lang w:val="en-US"/>
-        </w:rPr>
-        <w:t>1</w:t>
-      </w:r>
-      <w:r>
-        <w:rPr>
-          <w:sz w:val="28"/>
-          <w:szCs w:val="28"/>
-          <w:lang w:val="en-US"/>
-        </w:rPr>
-        <w:t>2</w:t>
+        </w:rPr>
+        <w:t>12</w:t>
       </w:r>
       <w:r>
         <w:rPr>
@@ -3290,7 +3388,6 @@
         <w:rPr>
           <w:sz w:val="28"/>
           <w:szCs w:val="28"/>
-          <w:lang w:val="en-US"/>
         </w:rPr>
         <w:t>8</w:t>
       </w:r>
@@ -3309,7 +3406,6 @@
         <w:rPr>
           <w:sz w:val="28"/>
           <w:szCs w:val="28"/>
-          <w:lang w:val="en-US"/>
         </w:rPr>
       </w:pPr>
     </w:p>
@@ -3361,7 +3457,6 @@
         </w:rPr>
         <w:t xml:space="preserve">Построить плоскость по коэффициентам уравнения в отрезках </w:t>
       </w:r>
-      <w:proofErr w:type="spellStart"/>
       <w:r>
         <w:rPr>
           <w:sz w:val="28"/>
@@ -3370,7 +3465,6 @@
         </w:rPr>
         <w:t>hx</w:t>
       </w:r>
-      <w:proofErr w:type="spellEnd"/>
       <w:r>
         <w:rPr>
           <w:sz w:val="28"/>
@@ -3392,7 +3486,6 @@
         </w:rPr>
         <w:t xml:space="preserve"> 8, </w:t>
       </w:r>
-      <w:proofErr w:type="spellStart"/>
       <w:r>
         <w:rPr>
           <w:sz w:val="28"/>
@@ -3401,7 +3494,6 @@
         </w:rPr>
         <w:t>hy</w:t>
       </w:r>
-      <w:proofErr w:type="spellEnd"/>
       <w:r>
         <w:rPr>
           <w:sz w:val="28"/>
@@ -3409,7 +3501,6 @@
         </w:rPr>
         <w:t xml:space="preserve"> – 1, </w:t>
       </w:r>
-      <w:proofErr w:type="spellStart"/>
       <w:r>
         <w:rPr>
           <w:sz w:val="28"/>
@@ -3418,7 +3509,6 @@
         </w:rPr>
         <w:t>hz</w:t>
       </w:r>
-      <w:proofErr w:type="spellEnd"/>
       <w:r>
         <w:rPr>
           <w:sz w:val="28"/>
@@ -3459,20 +3549,28 @@
           <w:sz w:val="28"/>
           <w:szCs w:val="28"/>
         </w:rPr>
-        <w:t>Для выполнения данного задания было выполнено несколько примеров, которые продемонстрированы в методическом указании.</w:t>
-      </w:r>
-    </w:p>
-    <w:p>
-      <w:pPr>
-        <w:spacing w:line="360" w:lineRule="auto"/>
-        <w:jc w:val="center"/>
-        <w:rPr>
-          <w:sz w:val="28"/>
-          <w:szCs w:val="28"/>
-        </w:rPr>
-      </w:pPr>
-      <w:r>
-        <w:rPr>
+        <w:t xml:space="preserve">Для выполнения данного задания </w:t>
+      </w:r>
+      <w:r>
+        <w:rPr>
+          <w:sz w:val="28"/>
+          <w:szCs w:val="28"/>
+        </w:rPr>
+        <w:t>была построена плоскость по уравнению, которое задано в отрезках. Входные значения даны в условии задачи.</w:t>
+      </w:r>
+    </w:p>
+    <w:p>
+      <w:pPr>
+        <w:spacing w:line="360" w:lineRule="auto"/>
+        <w:jc w:val="center"/>
+        <w:rPr>
+          <w:sz w:val="28"/>
+          <w:szCs w:val="28"/>
+        </w:rPr>
+      </w:pPr>
+      <w:r>
+        <w:rPr>
+          <w:noProof/>
           <w:sz w:val="28"/>
           <w:szCs w:val="28"/>
         </w:rPr>
@@ -3534,7 +3632,6 @@
         <w:rPr>
           <w:sz w:val="28"/>
           <w:szCs w:val="28"/>
-          <w:lang w:val="en-US"/>
         </w:rPr>
         <w:t>1</w:t>
       </w:r>
@@ -3543,28 +3640,7 @@
           <w:sz w:val="28"/>
           <w:szCs w:val="28"/>
         </w:rPr>
-        <w:t>3</w:t>
-      </w:r>
-      <w:r>
-        <w:rPr>
-          <w:sz w:val="28"/>
-          <w:szCs w:val="28"/>
-        </w:rPr>
-        <w:t xml:space="preserve">. Выполнение задания </w:t>
-      </w:r>
-      <w:r>
-        <w:rPr>
-          <w:sz w:val="28"/>
-          <w:szCs w:val="28"/>
-        </w:rPr>
-        <w:t>9</w:t>
-      </w:r>
-      <w:r>
-        <w:rPr>
-          <w:sz w:val="28"/>
-          <w:szCs w:val="28"/>
-        </w:rPr>
-        <w:t>.</w:t>
+        <w:t>3. Выполнение задания 9.</w:t>
       </w:r>
     </w:p>
     <w:p>
@@ -3612,21 +3688,7 @@
         <w:rPr>
           <w:sz w:val="28"/>
         </w:rPr>
-        <w:t xml:space="preserve">в среде </w:t>
-      </w:r>
-      <w:proofErr w:type="spellStart"/>
-      <w:r>
-        <w:rPr>
-          <w:sz w:val="28"/>
-        </w:rPr>
-        <w:t>MathCAD</w:t>
-      </w:r>
-      <w:proofErr w:type="spellEnd"/>
-      <w:r>
-        <w:rPr>
-          <w:sz w:val="28"/>
-        </w:rPr>
-        <w:t>.</w:t>
+        <w:t>в среде MathCAD.</w:t>
       </w:r>
     </w:p>
     <w:sectPr>

</xml_diff>